<commit_message>
docs: rebuild equal-component full index, report visuals, and submission documentation
</commit_message>
<xml_diff>
--- a/OISI_Results_and_Evidence_Submission_Report.docx
+++ b/OISI_Results_and_Evidence_Submission_Report.docx
@@ -51,7 +51,7 @@
       </w:pPr>
       <w:r>
         <w:rPr/>
-        <w:t>The all-entry equal-component OISI has a mean of 56.97 (SD 13.64), median 57.54, interquartile range 48.34–66.61, and observed range 23.57–86.05 across 112 infrastructures. The four component means are Community Engagement 60.75, Governance Practices 64.18, Organizational Capacity 57.27, and Development Activity 45.67. Development Activity has the lowest mean in the current zero-filled view; this reflects measured scores and the availability of platform-specific data, so it should not be interpreted as a standalone verdict on infrastructure quality.</w:t>
+        <w:t>The all-entry equal-component OISI has a mean of 57.07 (SD 13.60), median 57.71, interquartile range 48.34–66.61, and observed range 23.57–86.05 across 112 infrastructures. The four component means are Community Engagement 60.75, Governance Practices 64.18, Organizational Capacity 57.27, and Development Activity 46.10. Development Activity has the lowest mean in the current zero-filled view; this reflects measured scores and the availability of platform-specific data, so it should not be interpreted as a standalone verdict on infrastructure quality.</w:t>
       </w:r>
     </w:p>
     <w:p>
@@ -60,7 +60,7 @@
       </w:pPr>
       <w:r>
         <w:rPr/>
-        <w:t>Only 6 infrastructures have all 31 metrics observed. Their complete-data mean is 70.42; because this is a small subset, it is a diagnostic comparison, not a replacement for the all-entry result. The available-component diagnostic mean is 71.77, but its varying denominator makes it descriptive rather than a directly comparable performance ranking.</w:t>
+        <w:t>Only 6 infrastructures have all 31 metrics observed. Their complete-data mean is 70.42; because this is a small subset, it is a diagnostic comparison, not a replacement for the all-entry result. The available-component diagnostic mean is 71.49, but its varying denominator makes it descriptive rather than a directly comparable performance ranking.</w:t>
       </w:r>
     </w:p>
     <w:p>
@@ -224,7 +224,7 @@
               <w:spacing w:after="40" w:line="230" w:lineRule="auto"/>
             </w:pPr>
             <w:r>
-              <w:t>56.97 / 57.54</w:t>
+              <w:t>57.07 / 57.71</w:t>
             </w:r>
           </w:p>
         </w:tc>
@@ -265,7 +265,7 @@
               <w:spacing w:after="40" w:line="230" w:lineRule="auto"/>
             </w:pPr>
             <w:r>
-              <w:t>13.64 / 23.57–86.05</w:t>
+              <w:t>13.60 / 23.57–86.05</w:t>
             </w:r>
           </w:p>
         </w:tc>
@@ -388,7 +388,7 @@
               <w:spacing w:after="40" w:line="230" w:lineRule="auto"/>
             </w:pPr>
             <w:r>
-              <w:t>71.77</w:t>
+              <w:t>71.49</w:t>
             </w:r>
           </w:p>
         </w:tc>
@@ -555,7 +555,7 @@
       </w:pPr>
       <w:r>
         <w:rPr/>
-        <w:t>The zero-filled OISI spans 23.57 to 86.05; its mean (56.97) is below its median (57.54), indicating that lower-scoring entries pull the mean downward. Scores are distributed across the 0–100 scale rather than concentrated in a single narrow band. The histogram describes the observed index output, not an underlying normal population distribution.</w:t>
+        <w:t>The zero-filled OISI spans 23.57 to 86.05; its mean (57.07) is below its median (57.71), indicating that lower-scoring entries pull the mean downward. Scores are distributed across the 0–100 scale rather than concentrated in a single narrow band. The histogram describes the observed index output, not an underlying normal population distribution.</w:t>
       </w:r>
     </w:p>
     <w:p>
@@ -2369,7 +2369,7 @@
               <w:spacing w:after="40" w:line="230" w:lineRule="auto"/>
             </w:pPr>
             <w:r>
-              <w:t>45.67</w:t>
+              <w:t>46.10</w:t>
             </w:r>
           </w:p>
         </w:tc>
@@ -2395,7 +2395,7 @@
               <w:spacing w:after="40" w:line="230" w:lineRule="auto"/>
             </w:pPr>
             <w:r>
-              <w:t>10.03 / 13</w:t>
+              <w:t>10.28 / 13</w:t>
             </w:r>
           </w:p>
         </w:tc>
@@ -2408,7 +2408,7 @@
               <w:spacing w:after="40" w:line="230" w:lineRule="auto"/>
             </w:pPr>
             <w:r>
-              <w:t>77.1%</w:t>
+              <w:t>79.1%</w:t>
             </w:r>
           </w:p>
         </w:tc>
@@ -4127,7 +4127,7 @@
       </w:pPr>
       <w:r>
         <w:rPr/>
-        <w:t>The Development Activity zero-filled mean is 45.67, with 10.03 of thirteen metrics observed on average (77.1% average coverage). Git-derived continuity and recency measures are available for more entries than the issue-response and issue-closure rates, which require at least ten eligible events and a complete follow-up interval. Response and decision rates should therefore be read with their observed counts. Stars and forks are activity/attention proxies, not direct evidence of quality or successful downstream reuse.</w:t>
+        <w:t>The Development Activity zero-filled mean is 46.10, with 10.28 of thirteen metrics observed on average (79.1% average coverage). Git-derived continuity and recency measures are available for more entries than the issue-response and issue-closure rates, which require at least ten eligible events and a complete follow-up interval. Response and decision rates should therefore be read with their observed counts. Stars and forks are activity/attention proxies, not direct evidence of quality or successful downstream reuse.</w:t>
       </w:r>
     </w:p>
     <w:tbl>
@@ -4300,7 +4300,7 @@
               <w:spacing w:after="40" w:line="230" w:lineRule="auto"/>
             </w:pPr>
             <w:r>
-              <w:t>101/112 (90.2%)</w:t>
+              <w:t>102/112 (91.1%)</w:t>
             </w:r>
           </w:p>
         </w:tc>
@@ -4326,7 +4326,7 @@
               <w:spacing w:after="40" w:line="230" w:lineRule="auto"/>
             </w:pPr>
             <w:r>
-              <w:t>70.32</w:t>
+              <w:t>69.63</w:t>
             </w:r>
           </w:p>
         </w:tc>
@@ -4367,7 +4367,7 @@
               <w:spacing w:after="40" w:line="230" w:lineRule="auto"/>
             </w:pPr>
             <w:r>
-              <w:t>101/112 (90.2%)</w:t>
+              <w:t>102/112 (91.1%)</w:t>
             </w:r>
           </w:p>
         </w:tc>
@@ -4393,7 +4393,7 @@
               <w:spacing w:after="40" w:line="230" w:lineRule="auto"/>
             </w:pPr>
             <w:r>
-              <w:t>62.36</w:t>
+              <w:t>61.75</w:t>
             </w:r>
           </w:p>
         </w:tc>
@@ -4434,7 +4434,7 @@
               <w:spacing w:after="40" w:line="230" w:lineRule="auto"/>
             </w:pPr>
             <w:r>
-              <w:t>101/112 (90.2%)</w:t>
+              <w:t>102/112 (91.1%)</w:t>
             </w:r>
           </w:p>
         </w:tc>
@@ -4460,7 +4460,7 @@
               <w:spacing w:after="40" w:line="230" w:lineRule="auto"/>
             </w:pPr>
             <w:r>
-              <w:t>91.25</w:t>
+              <w:t>90.36</w:t>
             </w:r>
           </w:p>
         </w:tc>
@@ -4501,7 +4501,7 @@
               <w:spacing w:after="40" w:line="230" w:lineRule="auto"/>
             </w:pPr>
             <w:r>
-              <w:t>101/112 (90.2%)</w:t>
+              <w:t>102/112 (91.1%)</w:t>
             </w:r>
           </w:p>
         </w:tc>
@@ -4527,7 +4527,7 @@
               <w:spacing w:after="40" w:line="230" w:lineRule="auto"/>
             </w:pPr>
             <w:r>
-              <w:t>69.80</w:t>
+              <w:t>69.12</w:t>
             </w:r>
           </w:p>
         </w:tc>
@@ -4568,7 +4568,7 @@
               <w:spacing w:after="40" w:line="230" w:lineRule="auto"/>
             </w:pPr>
             <w:r>
-              <w:t>101/112 (90.2%)</w:t>
+              <w:t>102/112 (91.1%)</w:t>
             </w:r>
           </w:p>
         </w:tc>
@@ -4594,7 +4594,7 @@
               <w:spacing w:after="40" w:line="230" w:lineRule="auto"/>
             </w:pPr>
             <w:r>
-              <w:t>52.44</w:t>
+              <w:t>51.92</w:t>
             </w:r>
           </w:p>
         </w:tc>
@@ -4635,7 +4635,7 @@
               <w:spacing w:after="40" w:line="230" w:lineRule="auto"/>
             </w:pPr>
             <w:r>
-              <w:t>101/112 (90.2%)</w:t>
+              <w:t>102/112 (91.1%)</w:t>
             </w:r>
           </w:p>
         </w:tc>
@@ -4661,7 +4661,7 @@
               <w:spacing w:after="40" w:line="230" w:lineRule="auto"/>
             </w:pPr>
             <w:r>
-              <w:t>47.33</w:t>
+              <w:t>46.87</w:t>
             </w:r>
           </w:p>
         </w:tc>
@@ -4702,7 +4702,7 @@
               <w:spacing w:after="40" w:line="230" w:lineRule="auto"/>
             </w:pPr>
             <w:r>
-              <w:t>101/112 (90.2%)</w:t>
+              <w:t>102/112 (91.1%)</w:t>
             </w:r>
           </w:p>
         </w:tc>
@@ -4728,7 +4728,7 @@
               <w:spacing w:after="40" w:line="230" w:lineRule="auto"/>
             </w:pPr>
             <w:r>
-              <w:t>61.88</w:t>
+              <w:t>61.27</w:t>
             </w:r>
           </w:p>
         </w:tc>
@@ -4769,7 +4769,7 @@
               <w:spacing w:after="40" w:line="230" w:lineRule="auto"/>
             </w:pPr>
             <w:r>
-              <w:t>54/112 (48.2%)</w:t>
+              <w:t>56/112 (50.0%)</w:t>
             </w:r>
           </w:p>
         </w:tc>
@@ -4782,7 +4782,7 @@
               <w:spacing w:after="40" w:line="230" w:lineRule="auto"/>
             </w:pPr>
             <w:r>
-              <w:t>21.53</w:t>
+              <w:t>21.81</w:t>
             </w:r>
           </w:p>
         </w:tc>
@@ -4795,7 +4795,7 @@
               <w:spacing w:after="40" w:line="230" w:lineRule="auto"/>
             </w:pPr>
             <w:r>
-              <w:t>44.65</w:t>
+              <w:t>43.63</w:t>
             </w:r>
           </w:p>
         </w:tc>
@@ -4836,7 +4836,7 @@
               <w:spacing w:after="40" w:line="230" w:lineRule="auto"/>
             </w:pPr>
             <w:r>
-              <w:t>65/112 (58.0%)</w:t>
+              <w:t>68/112 (60.7%)</w:t>
             </w:r>
           </w:p>
         </w:tc>
@@ -4849,7 +4849,7 @@
               <w:spacing w:after="40" w:line="230" w:lineRule="auto"/>
             </w:pPr>
             <w:r>
-              <w:t>33.65</w:t>
+              <w:t>34.81</w:t>
             </w:r>
           </w:p>
         </w:tc>
@@ -4862,7 +4862,7 @@
               <w:spacing w:after="40" w:line="230" w:lineRule="auto"/>
             </w:pPr>
             <w:r>
-              <w:t>57.98</w:t>
+              <w:t>57.33</w:t>
             </w:r>
           </w:p>
         </w:tc>
@@ -4903,7 +4903,7 @@
               <w:spacing w:after="40" w:line="230" w:lineRule="auto"/>
             </w:pPr>
             <w:r>
-              <w:t>52/112 (46.4%)</w:t>
+              <w:t>53/112 (47.3%)</w:t>
             </w:r>
           </w:p>
         </w:tc>
@@ -4916,7 +4916,7 @@
               <w:spacing w:after="40" w:line="230" w:lineRule="auto"/>
             </w:pPr>
             <w:r>
-              <w:t>19.71</w:t>
+              <w:t>20.21</w:t>
             </w:r>
           </w:p>
         </w:tc>
@@ -4929,7 +4929,7 @@
               <w:spacing w:after="40" w:line="230" w:lineRule="auto"/>
             </w:pPr>
             <w:r>
-              <w:t>42.46</w:t>
+              <w:t>42.71</w:t>
             </w:r>
           </w:p>
         </w:tc>
@@ -4970,7 +4970,7 @@
               <w:spacing w:after="40" w:line="230" w:lineRule="auto"/>
             </w:pPr>
             <w:r>
-              <w:t>65/112 (58.0%)</w:t>
+              <w:t>68/112 (60.7%)</w:t>
             </w:r>
           </w:p>
         </w:tc>
@@ -4983,7 +4983,7 @@
               <w:spacing w:after="40" w:line="230" w:lineRule="auto"/>
             </w:pPr>
             <w:r>
-              <w:t>48.40</w:t>
+              <w:t>50.74</w:t>
             </w:r>
           </w:p>
         </w:tc>
@@ -4996,7 +4996,7 @@
               <w:spacing w:after="40" w:line="230" w:lineRule="auto"/>
             </w:pPr>
             <w:r>
-              <w:t>83.40</w:t>
+              <w:t>83.57</w:t>
             </w:r>
           </w:p>
         </w:tc>
@@ -5037,7 +5037,7 @@
               <w:spacing w:after="40" w:line="230" w:lineRule="auto"/>
             </w:pPr>
             <w:r>
-              <w:t>90/112 (80.4%)</w:t>
+              <w:t>96/112 (85.7%)</w:t>
             </w:r>
           </w:p>
         </w:tc>
@@ -5050,7 +5050,7 @@
               <w:spacing w:after="40" w:line="230" w:lineRule="auto"/>
             </w:pPr>
             <w:r>
-              <w:t>28.24</w:t>
+              <w:t>28.83</w:t>
             </w:r>
           </w:p>
         </w:tc>
@@ -5063,7 +5063,7 @@
               <w:spacing w:after="40" w:line="230" w:lineRule="auto"/>
             </w:pPr>
             <w:r>
-              <w:t>35.15</w:t>
+              <w:t>33.64</w:t>
             </w:r>
           </w:p>
         </w:tc>
@@ -5104,7 +5104,7 @@
               <w:spacing w:after="40" w:line="230" w:lineRule="auto"/>
             </w:pPr>
             <w:r>
-              <w:t>90/112 (80.4%)</w:t>
+              <w:t>96/112 (85.7%)</w:t>
             </w:r>
           </w:p>
         </w:tc>
@@ -5117,7 +5117,7 @@
               <w:spacing w:after="40" w:line="230" w:lineRule="auto"/>
             </w:pPr>
             <w:r>
-              <w:t>31.55</w:t>
+              <w:t>32.22</w:t>
             </w:r>
           </w:p>
         </w:tc>
@@ -5130,7 +5130,7 @@
               <w:spacing w:after="40" w:line="230" w:lineRule="auto"/>
             </w:pPr>
             <w:r>
-              <w:t>39.26</w:t>
+              <w:t>37.59</w:t>
             </w:r>
           </w:p>
         </w:tc>
@@ -5430,7 +5430,7 @@
               <w:spacing w:after="40" w:line="230" w:lineRule="auto"/>
             </w:pPr>
             <w:r>
-              <w:t>56.97</w:t>
+              <w:t>57.07</w:t>
             </w:r>
           </w:p>
         </w:tc>
@@ -5538,7 +5538,7 @@
               <w:spacing w:after="40" w:line="230" w:lineRule="auto"/>
             </w:pPr>
             <w:r>
-              <w:t>71.77</w:t>
+              <w:t>71.49</w:t>
             </w:r>
           </w:p>
         </w:tc>
@@ -5587,7 +5587,7 @@
       </w:pPr>
       <w:r>
         <w:rPr/>
-        <w:t>The final integrated OISI included 112 infrastructures and combined four equally weighted components: Community Engagement, Governance Practices, Organizational Capacity, and Development Activity. Each component contributed 25% of the overall score, with equal metric weights within each component. In the all-entry zero-filled view, the mean OISI was 56.97 (SD 13.64; median 57.54; range 23.57–86.05). Component means were Community Engagement: 60.75; Governance Practices: 64.18; Organizational Capacity: 57.27; Development Activity: 45.67. These are evidence-adjusted results because unavailable metric values were assigned zero while their observed status was retained.</w:t>
+        <w:t>The final integrated OISI included 112 infrastructures and combined four equally weighted components: Community Engagement, Governance Practices, Organizational Capacity, and Development Activity. Each component contributed 25% of the overall score, with equal metric weights within each component. In the all-entry zero-filled view, the mean OISI was 57.07 (SD 13.60; median 57.71; range 23.57–86.05). Component means were Community Engagement: 60.75; Governance Practices: 64.18; Organizational Capacity: 57.27; Development Activity: 46.10. These are evidence-adjusted results because unavailable metric values were assigned zero while their observed status was retained.</w:t>
       </w:r>
     </w:p>
     <w:p>
@@ -5596,7 +5596,7 @@
       </w:pPr>
       <w:r>
         <w:rPr/>
-        <w:t>Six infrastructures had observed values for all 31 component metrics. Their mean score was 70.42; this small complete-data subset is reported as a diagnostic and should not be generalized to the full population. The available-component diagnostic mean was 71.77; since it uses a variable denominator, it is descriptive rather than a directly comparable ranking. Metric-level availability differed across components and indicators, particularly for narrative staffing/support fields and GitHub event-rate measures. Results should therefore be interpreted alongside component scores and observed-data coverage.</w:t>
+        <w:t>Six infrastructures had observed values for all 31 component metrics. Their mean score was 70.42; this small complete-data subset is reported as a diagnostic and should not be generalized to the full population. The available-component diagnostic mean was 71.49; since it uses a variable denominator, it is descriptive rather than a directly comparable ranking. Metric-level availability differed across components and indicators, particularly for narrative staffing/support fields and GitHub event-rate measures. Results should therefore be interpreted alongside component scores and observed-data coverage.</w:t>
       </w:r>
     </w:p>
     <w:p>
@@ -10467,46 +10467,46 @@
               <w:spacing w:after="40" w:line="230" w:lineRule="auto"/>
             </w:pPr>
             <w:r>
-              <w:t>Research Organization Registry (ROR)</w:t>
-            </w:r>
-          </w:p>
-        </w:tc>
-        <w:tc>
-          <w:tcPr>
-            <w:tcW w:w="700" w:type="dxa"/>
-          </w:tcPr>
-          <w:p>
-            <w:pPr>
-              <w:spacing w:after="40" w:line="230" w:lineRule="auto"/>
-            </w:pPr>
-            <w:r>
-              <w:t>62.02</w:t>
-            </w:r>
-          </w:p>
-        </w:tc>
-        <w:tc>
-          <w:tcPr>
-            <w:tcW w:w="700" w:type="dxa"/>
-          </w:tcPr>
-          <w:p>
-            <w:pPr>
-              <w:spacing w:after="40" w:line="230" w:lineRule="auto"/>
-            </w:pPr>
-            <w:r>
-              <w:t>88.75</w:t>
-            </w:r>
-          </w:p>
-        </w:tc>
-        <w:tc>
-          <w:tcPr>
-            <w:tcW w:w="900" w:type="dxa"/>
-          </w:tcPr>
-          <w:p>
-            <w:pPr>
-              <w:spacing w:after="40" w:line="230" w:lineRule="auto"/>
-            </w:pPr>
-            <w:r>
-              <w:t>80.86</w:t>
+              <w:t>COUNTER Code of Practice</w:t>
+            </w:r>
+          </w:p>
+        </w:tc>
+        <w:tc>
+          <w:tcPr>
+            <w:tcW w:w="700" w:type="dxa"/>
+          </w:tcPr>
+          <w:p>
+            <w:pPr>
+              <w:spacing w:after="40" w:line="230" w:lineRule="auto"/>
+            </w:pPr>
+            <w:r>
+              <w:t>62.17</w:t>
+            </w:r>
+          </w:p>
+        </w:tc>
+        <w:tc>
+          <w:tcPr>
+            <w:tcW w:w="700" w:type="dxa"/>
+          </w:tcPr>
+          <w:p>
+            <w:pPr>
+              <w:spacing w:after="40" w:line="230" w:lineRule="auto"/>
+            </w:pPr>
+            <w:r>
+              <w:t>70.80</w:t>
+            </w:r>
+          </w:p>
+        </w:tc>
+        <w:tc>
+          <w:tcPr>
+            <w:tcW w:w="900" w:type="dxa"/>
+          </w:tcPr>
+          <w:p>
+            <w:pPr>
+              <w:spacing w:after="40" w:line="230" w:lineRule="auto"/>
+            </w:pPr>
+            <w:r>
+              <w:t>95.29</w:t>
             </w:r>
           </w:p>
         </w:tc>
@@ -10532,7 +10532,7 @@
               <w:spacing w:after="40" w:line="230" w:lineRule="auto"/>
             </w:pPr>
             <w:r>
-              <w:t>38.48</w:t>
+              <w:t>42.58</w:t>
             </w:r>
           </w:p>
         </w:tc>
@@ -10545,7 +10545,7 @@
               <w:spacing w:after="40" w:line="230" w:lineRule="auto"/>
             </w:pPr>
             <w:r>
-              <w:t>26/31</w:t>
+              <w:t>28/31</w:t>
             </w:r>
           </w:p>
         </w:tc>
@@ -10573,46 +10573,46 @@
               <w:spacing w:after="40" w:line="230" w:lineRule="auto"/>
             </w:pPr>
             <w:r>
-              <w:t>CLOCKSS</w:t>
-            </w:r>
-          </w:p>
-        </w:tc>
-        <w:tc>
-          <w:tcPr>
-            <w:tcW w:w="700" w:type="dxa"/>
-          </w:tcPr>
-          <w:p>
-            <w:pPr>
-              <w:spacing w:after="40" w:line="230" w:lineRule="auto"/>
-            </w:pPr>
-            <w:r>
-              <w:t>61.83</w:t>
-            </w:r>
-          </w:p>
-        </w:tc>
-        <w:tc>
-          <w:tcPr>
-            <w:tcW w:w="700" w:type="dxa"/>
-          </w:tcPr>
-          <w:p>
-            <w:pPr>
-              <w:spacing w:after="40" w:line="230" w:lineRule="auto"/>
-            </w:pPr>
-            <w:r>
-              <w:t>38.83</w:t>
-            </w:r>
-          </w:p>
-        </w:tc>
-        <w:tc>
-          <w:tcPr>
-            <w:tcW w:w="900" w:type="dxa"/>
-          </w:tcPr>
-          <w:p>
-            <w:pPr>
-              <w:spacing w:after="40" w:line="230" w:lineRule="auto"/>
-            </w:pPr>
-            <w:r>
-              <w:t>95.29</w:t>
+              <w:t>Research Organization Registry (ROR)</w:t>
+            </w:r>
+          </w:p>
+        </w:tc>
+        <w:tc>
+          <w:tcPr>
+            <w:tcW w:w="700" w:type="dxa"/>
+          </w:tcPr>
+          <w:p>
+            <w:pPr>
+              <w:spacing w:after="40" w:line="230" w:lineRule="auto"/>
+            </w:pPr>
+            <w:r>
+              <w:t>62.02</w:t>
+            </w:r>
+          </w:p>
+        </w:tc>
+        <w:tc>
+          <w:tcPr>
+            <w:tcW w:w="700" w:type="dxa"/>
+          </w:tcPr>
+          <w:p>
+            <w:pPr>
+              <w:spacing w:after="40" w:line="230" w:lineRule="auto"/>
+            </w:pPr>
+            <w:r>
+              <w:t>88.75</w:t>
+            </w:r>
+          </w:p>
+        </w:tc>
+        <w:tc>
+          <w:tcPr>
+            <w:tcW w:w="900" w:type="dxa"/>
+          </w:tcPr>
+          <w:p>
+            <w:pPr>
+              <w:spacing w:after="40" w:line="230" w:lineRule="auto"/>
+            </w:pPr>
+            <w:r>
+              <w:t>80.86</w:t>
             </w:r>
           </w:p>
         </w:tc>
@@ -10625,20 +10625,20 @@
               <w:spacing w:after="40" w:line="230" w:lineRule="auto"/>
             </w:pPr>
             <w:r>
-              <w:t>62.50</w:t>
-            </w:r>
-          </w:p>
-        </w:tc>
-        <w:tc>
-          <w:tcPr>
-            <w:tcW w:w="900" w:type="dxa"/>
-          </w:tcPr>
-          <w:p>
-            <w:pPr>
-              <w:spacing w:after="40" w:line="230" w:lineRule="auto"/>
-            </w:pPr>
-            <w:r>
-              <w:t>50.70</w:t>
+              <w:t>40.00</w:t>
+            </w:r>
+          </w:p>
+        </w:tc>
+        <w:tc>
+          <w:tcPr>
+            <w:tcW w:w="900" w:type="dxa"/>
+          </w:tcPr>
+          <w:p>
+            <w:pPr>
+              <w:spacing w:after="40" w:line="230" w:lineRule="auto"/>
+            </w:pPr>
+            <w:r>
+              <w:t>38.48</w:t>
             </w:r>
           </w:p>
         </w:tc>
@@ -10651,7 +10651,7 @@
               <w:spacing w:after="40" w:line="230" w:lineRule="auto"/>
             </w:pPr>
             <w:r>
-              <w:t>23/31</w:t>
+              <w:t>26/31</w:t>
             </w:r>
           </w:p>
         </w:tc>
@@ -10679,46 +10679,46 @@
               <w:spacing w:after="40" w:line="230" w:lineRule="auto"/>
             </w:pPr>
             <w:r>
-              <w:t>Biodiversity Heritage Library</w:t>
-            </w:r>
-          </w:p>
-        </w:tc>
-        <w:tc>
-          <w:tcPr>
-            <w:tcW w:w="700" w:type="dxa"/>
-          </w:tcPr>
-          <w:p>
-            <w:pPr>
-              <w:spacing w:after="40" w:line="230" w:lineRule="auto"/>
-            </w:pPr>
-            <w:r>
-              <w:t>61.81</w:t>
-            </w:r>
-          </w:p>
-        </w:tc>
-        <w:tc>
-          <w:tcPr>
-            <w:tcW w:w="700" w:type="dxa"/>
-          </w:tcPr>
-          <w:p>
-            <w:pPr>
-              <w:spacing w:after="40" w:line="230" w:lineRule="auto"/>
-            </w:pPr>
-            <w:r>
-              <w:t>77.49</w:t>
-            </w:r>
-          </w:p>
-        </w:tc>
-        <w:tc>
-          <w:tcPr>
-            <w:tcW w:w="900" w:type="dxa"/>
-          </w:tcPr>
-          <w:p>
-            <w:pPr>
-              <w:spacing w:after="40" w:line="230" w:lineRule="auto"/>
-            </w:pPr>
-            <w:r>
-              <w:t>80.86</w:t>
+              <w:t>CLOCKSS</w:t>
+            </w:r>
+          </w:p>
+        </w:tc>
+        <w:tc>
+          <w:tcPr>
+            <w:tcW w:w="700" w:type="dxa"/>
+          </w:tcPr>
+          <w:p>
+            <w:pPr>
+              <w:spacing w:after="40" w:line="230" w:lineRule="auto"/>
+            </w:pPr>
+            <w:r>
+              <w:t>61.83</w:t>
+            </w:r>
+          </w:p>
+        </w:tc>
+        <w:tc>
+          <w:tcPr>
+            <w:tcW w:w="700" w:type="dxa"/>
+          </w:tcPr>
+          <w:p>
+            <w:pPr>
+              <w:spacing w:after="40" w:line="230" w:lineRule="auto"/>
+            </w:pPr>
+            <w:r>
+              <w:t>38.83</w:t>
+            </w:r>
+          </w:p>
+        </w:tc>
+        <w:tc>
+          <w:tcPr>
+            <w:tcW w:w="900" w:type="dxa"/>
+          </w:tcPr>
+          <w:p>
+            <w:pPr>
+              <w:spacing w:after="40" w:line="230" w:lineRule="auto"/>
+            </w:pPr>
+            <w:r>
+              <w:t>95.29</w:t>
             </w:r>
           </w:p>
         </w:tc>
@@ -10744,7 +10744,7 @@
               <w:spacing w:after="40" w:line="230" w:lineRule="auto"/>
             </w:pPr>
             <w:r>
-              <w:t>26.41</w:t>
+              <w:t>50.70</w:t>
             </w:r>
           </w:p>
         </w:tc>
@@ -10757,7 +10757,7 @@
               <w:spacing w:after="40" w:line="230" w:lineRule="auto"/>
             </w:pPr>
             <w:r>
-              <w:t>26/31</w:t>
+              <w:t>23/31</w:t>
             </w:r>
           </w:p>
         </w:tc>
@@ -10785,46 +10785,46 @@
               <w:spacing w:after="40" w:line="230" w:lineRule="auto"/>
             </w:pPr>
             <w:r>
-              <w:t>Public Access Submission System</w:t>
-            </w:r>
-          </w:p>
-        </w:tc>
-        <w:tc>
-          <w:tcPr>
-            <w:tcW w:w="700" w:type="dxa"/>
-          </w:tcPr>
-          <w:p>
-            <w:pPr>
-              <w:spacing w:after="40" w:line="230" w:lineRule="auto"/>
-            </w:pPr>
-            <w:r>
-              <w:t>60.90</w:t>
-            </w:r>
-          </w:p>
-        </w:tc>
-        <w:tc>
-          <w:tcPr>
-            <w:tcW w:w="700" w:type="dxa"/>
-          </w:tcPr>
-          <w:p>
-            <w:pPr>
-              <w:spacing w:after="40" w:line="230" w:lineRule="auto"/>
-            </w:pPr>
-            <w:r>
-              <w:t>68.57</w:t>
-            </w:r>
-          </w:p>
-        </w:tc>
-        <w:tc>
-          <w:tcPr>
-            <w:tcW w:w="900" w:type="dxa"/>
-          </w:tcPr>
-          <w:p>
-            <w:pPr>
-              <w:spacing w:after="40" w:line="230" w:lineRule="auto"/>
-            </w:pPr>
-            <w:r>
-              <w:t>76.14</w:t>
+              <w:t>Biodiversity Heritage Library</w:t>
+            </w:r>
+          </w:p>
+        </w:tc>
+        <w:tc>
+          <w:tcPr>
+            <w:tcW w:w="700" w:type="dxa"/>
+          </w:tcPr>
+          <w:p>
+            <w:pPr>
+              <w:spacing w:after="40" w:line="230" w:lineRule="auto"/>
+            </w:pPr>
+            <w:r>
+              <w:t>61.81</w:t>
+            </w:r>
+          </w:p>
+        </w:tc>
+        <w:tc>
+          <w:tcPr>
+            <w:tcW w:w="700" w:type="dxa"/>
+          </w:tcPr>
+          <w:p>
+            <w:pPr>
+              <w:spacing w:after="40" w:line="230" w:lineRule="auto"/>
+            </w:pPr>
+            <w:r>
+              <w:t>77.49</w:t>
+            </w:r>
+          </w:p>
+        </w:tc>
+        <w:tc>
+          <w:tcPr>
+            <w:tcW w:w="900" w:type="dxa"/>
+          </w:tcPr>
+          <w:p>
+            <w:pPr>
+              <w:spacing w:after="40" w:line="230" w:lineRule="auto"/>
+            </w:pPr>
+            <w:r>
+              <w:t>80.86</w:t>
             </w:r>
           </w:p>
         </w:tc>
@@ -10837,20 +10837,20 @@
               <w:spacing w:after="40" w:line="230" w:lineRule="auto"/>
             </w:pPr>
             <w:r>
-              <w:t>40.00</w:t>
-            </w:r>
-          </w:p>
-        </w:tc>
-        <w:tc>
-          <w:tcPr>
-            <w:tcW w:w="900" w:type="dxa"/>
-          </w:tcPr>
-          <w:p>
-            <w:pPr>
-              <w:spacing w:after="40" w:line="230" w:lineRule="auto"/>
-            </w:pPr>
-            <w:r>
-              <w:t>58.89</w:t>
+              <w:t>62.50</w:t>
+            </w:r>
+          </w:p>
+        </w:tc>
+        <w:tc>
+          <w:tcPr>
+            <w:tcW w:w="900" w:type="dxa"/>
+          </w:tcPr>
+          <w:p>
+            <w:pPr>
+              <w:spacing w:after="40" w:line="230" w:lineRule="auto"/>
+            </w:pPr>
+            <w:r>
+              <w:t>26.41</w:t>
             </w:r>
           </w:p>
         </w:tc>
@@ -10863,7 +10863,7 @@
               <w:spacing w:after="40" w:line="230" w:lineRule="auto"/>
             </w:pPr>
             <w:r>
-              <w:t>28/31</w:t>
+              <w:t>26/31</w:t>
             </w:r>
           </w:p>
         </w:tc>
@@ -10891,46 +10891,46 @@
               <w:spacing w:after="40" w:line="230" w:lineRule="auto"/>
             </w:pPr>
             <w:r>
-              <w:t>ARGOS</w:t>
-            </w:r>
-          </w:p>
-        </w:tc>
-        <w:tc>
-          <w:tcPr>
-            <w:tcW w:w="700" w:type="dxa"/>
-          </w:tcPr>
-          <w:p>
-            <w:pPr>
-              <w:spacing w:after="40" w:line="230" w:lineRule="auto"/>
-            </w:pPr>
-            <w:r>
-              <w:t>60.19</w:t>
-            </w:r>
-          </w:p>
-        </w:tc>
-        <w:tc>
-          <w:tcPr>
-            <w:tcW w:w="700" w:type="dxa"/>
-          </w:tcPr>
-          <w:p>
-            <w:pPr>
-              <w:spacing w:after="40" w:line="230" w:lineRule="auto"/>
-            </w:pPr>
-            <w:r>
-              <w:t>60.26</w:t>
-            </w:r>
-          </w:p>
-        </w:tc>
-        <w:tc>
-          <w:tcPr>
-            <w:tcW w:w="900" w:type="dxa"/>
-          </w:tcPr>
-          <w:p>
-            <w:pPr>
-              <w:spacing w:after="40" w:line="230" w:lineRule="auto"/>
-            </w:pPr>
-            <w:r>
-              <w:t>95.29</w:t>
+              <w:t>Public Access Submission System</w:t>
+            </w:r>
+          </w:p>
+        </w:tc>
+        <w:tc>
+          <w:tcPr>
+            <w:tcW w:w="700" w:type="dxa"/>
+          </w:tcPr>
+          <w:p>
+            <w:pPr>
+              <w:spacing w:after="40" w:line="230" w:lineRule="auto"/>
+            </w:pPr>
+            <w:r>
+              <w:t>60.90</w:t>
+            </w:r>
+          </w:p>
+        </w:tc>
+        <w:tc>
+          <w:tcPr>
+            <w:tcW w:w="700" w:type="dxa"/>
+          </w:tcPr>
+          <w:p>
+            <w:pPr>
+              <w:spacing w:after="40" w:line="230" w:lineRule="auto"/>
+            </w:pPr>
+            <w:r>
+              <w:t>68.57</w:t>
+            </w:r>
+          </w:p>
+        </w:tc>
+        <w:tc>
+          <w:tcPr>
+            <w:tcW w:w="900" w:type="dxa"/>
+          </w:tcPr>
+          <w:p>
+            <w:pPr>
+              <w:spacing w:after="40" w:line="230" w:lineRule="auto"/>
+            </w:pPr>
+            <w:r>
+              <w:t>76.14</w:t>
             </w:r>
           </w:p>
         </w:tc>
@@ -10943,20 +10943,20 @@
               <w:spacing w:after="40" w:line="230" w:lineRule="auto"/>
             </w:pPr>
             <w:r>
-              <w:t>70.00</w:t>
-            </w:r>
-          </w:p>
-        </w:tc>
-        <w:tc>
-          <w:tcPr>
-            <w:tcW w:w="900" w:type="dxa"/>
-          </w:tcPr>
-          <w:p>
-            <w:pPr>
-              <w:spacing w:after="40" w:line="230" w:lineRule="auto"/>
-            </w:pPr>
-            <w:r>
-              <w:t>15.22</w:t>
+              <w:t>40.00</w:t>
+            </w:r>
+          </w:p>
+        </w:tc>
+        <w:tc>
+          <w:tcPr>
+            <w:tcW w:w="900" w:type="dxa"/>
+          </w:tcPr>
+          <w:p>
+            <w:pPr>
+              <w:spacing w:after="40" w:line="230" w:lineRule="auto"/>
+            </w:pPr>
+            <w:r>
+              <w:t>58.89</w:t>
             </w:r>
           </w:p>
         </w:tc>
@@ -10969,7 +10969,7 @@
               <w:spacing w:after="40" w:line="230" w:lineRule="auto"/>
             </w:pPr>
             <w:r>
-              <w:t>24/31</w:t>
+              <w:t>28/31</w:t>
             </w:r>
           </w:p>
         </w:tc>
@@ -10997,46 +10997,46 @@
               <w:spacing w:after="40" w:line="230" w:lineRule="auto"/>
             </w:pPr>
             <w:r>
-              <w:t>Dryad</w:t>
-            </w:r>
-          </w:p>
-        </w:tc>
-        <w:tc>
-          <w:tcPr>
-            <w:tcW w:w="700" w:type="dxa"/>
-          </w:tcPr>
-          <w:p>
-            <w:pPr>
-              <w:spacing w:after="40" w:line="230" w:lineRule="auto"/>
-            </w:pPr>
-            <w:r>
-              <w:t>60.01</w:t>
-            </w:r>
-          </w:p>
-        </w:tc>
-        <w:tc>
-          <w:tcPr>
-            <w:tcW w:w="700" w:type="dxa"/>
-          </w:tcPr>
-          <w:p>
-            <w:pPr>
-              <w:spacing w:after="40" w:line="230" w:lineRule="auto"/>
-            </w:pPr>
-            <w:r>
-              <w:t>62.54</w:t>
-            </w:r>
-          </w:p>
-        </w:tc>
-        <w:tc>
-          <w:tcPr>
-            <w:tcW w:w="900" w:type="dxa"/>
-          </w:tcPr>
-          <w:p>
-            <w:pPr>
-              <w:spacing w:after="40" w:line="230" w:lineRule="auto"/>
-            </w:pPr>
-            <w:r>
-              <w:t>81.00</w:t>
+              <w:t>ARGOS</w:t>
+            </w:r>
+          </w:p>
+        </w:tc>
+        <w:tc>
+          <w:tcPr>
+            <w:tcW w:w="700" w:type="dxa"/>
+          </w:tcPr>
+          <w:p>
+            <w:pPr>
+              <w:spacing w:after="40" w:line="230" w:lineRule="auto"/>
+            </w:pPr>
+            <w:r>
+              <w:t>60.19</w:t>
+            </w:r>
+          </w:p>
+        </w:tc>
+        <w:tc>
+          <w:tcPr>
+            <w:tcW w:w="700" w:type="dxa"/>
+          </w:tcPr>
+          <w:p>
+            <w:pPr>
+              <w:spacing w:after="40" w:line="230" w:lineRule="auto"/>
+            </w:pPr>
+            <w:r>
+              <w:t>60.26</w:t>
+            </w:r>
+          </w:p>
+        </w:tc>
+        <w:tc>
+          <w:tcPr>
+            <w:tcW w:w="900" w:type="dxa"/>
+          </w:tcPr>
+          <w:p>
+            <w:pPr>
+              <w:spacing w:after="40" w:line="230" w:lineRule="auto"/>
+            </w:pPr>
+            <w:r>
+              <w:t>95.29</w:t>
             </w:r>
           </w:p>
         </w:tc>
@@ -11049,20 +11049,20 @@
               <w:spacing w:after="40" w:line="230" w:lineRule="auto"/>
             </w:pPr>
             <w:r>
-              <w:t>40.00</w:t>
-            </w:r>
-          </w:p>
-        </w:tc>
-        <w:tc>
-          <w:tcPr>
-            <w:tcW w:w="900" w:type="dxa"/>
-          </w:tcPr>
-          <w:p>
-            <w:pPr>
-              <w:spacing w:after="40" w:line="230" w:lineRule="auto"/>
-            </w:pPr>
-            <w:r>
-              <w:t>56.50</w:t>
+              <w:t>70.00</w:t>
+            </w:r>
+          </w:p>
+        </w:tc>
+        <w:tc>
+          <w:tcPr>
+            <w:tcW w:w="900" w:type="dxa"/>
+          </w:tcPr>
+          <w:p>
+            <w:pPr>
+              <w:spacing w:after="40" w:line="230" w:lineRule="auto"/>
+            </w:pPr>
+            <w:r>
+              <w:t>15.22</w:t>
             </w:r>
           </w:p>
         </w:tc>
@@ -11075,7 +11075,7 @@
               <w:spacing w:after="40" w:line="230" w:lineRule="auto"/>
             </w:pPr>
             <w:r>
-              <w:t>25/31</w:t>
+              <w:t>24/31</w:t>
             </w:r>
           </w:p>
         </w:tc>
@@ -11103,46 +11103,46 @@
               <w:spacing w:after="40" w:line="230" w:lineRule="auto"/>
             </w:pPr>
             <w:r>
-              <w:t>Fulcrum</w:t>
-            </w:r>
-          </w:p>
-        </w:tc>
-        <w:tc>
-          <w:tcPr>
-            <w:tcW w:w="700" w:type="dxa"/>
-          </w:tcPr>
-          <w:p>
-            <w:pPr>
-              <w:spacing w:after="40" w:line="230" w:lineRule="auto"/>
-            </w:pPr>
-            <w:r>
-              <w:t>59.84</w:t>
-            </w:r>
-          </w:p>
-        </w:tc>
-        <w:tc>
-          <w:tcPr>
-            <w:tcW w:w="700" w:type="dxa"/>
-          </w:tcPr>
-          <w:p>
-            <w:pPr>
-              <w:spacing w:after="40" w:line="230" w:lineRule="auto"/>
-            </w:pPr>
-            <w:r>
-              <w:t>58.83</w:t>
-            </w:r>
-          </w:p>
-        </w:tc>
-        <w:tc>
-          <w:tcPr>
-            <w:tcW w:w="900" w:type="dxa"/>
-          </w:tcPr>
-          <w:p>
-            <w:pPr>
-              <w:spacing w:after="40" w:line="230" w:lineRule="auto"/>
-            </w:pPr>
-            <w:r>
-              <w:t>64.29</w:t>
+              <w:t>CORE</w:t>
+            </w:r>
+          </w:p>
+        </w:tc>
+        <w:tc>
+          <w:tcPr>
+            <w:tcW w:w="700" w:type="dxa"/>
+          </w:tcPr>
+          <w:p>
+            <w:pPr>
+              <w:spacing w:after="40" w:line="230" w:lineRule="auto"/>
+            </w:pPr>
+            <w:r>
+              <w:t>60.11</w:t>
+            </w:r>
+          </w:p>
+        </w:tc>
+        <w:tc>
+          <w:tcPr>
+            <w:tcW w:w="700" w:type="dxa"/>
+          </w:tcPr>
+          <w:p>
+            <w:pPr>
+              <w:spacing w:after="40" w:line="230" w:lineRule="auto"/>
+            </w:pPr>
+            <w:r>
+              <w:t>65.17</w:t>
+            </w:r>
+          </w:p>
+        </w:tc>
+        <w:tc>
+          <w:tcPr>
+            <w:tcW w:w="900" w:type="dxa"/>
+          </w:tcPr>
+          <w:p>
+            <w:pPr>
+              <w:spacing w:after="40" w:line="230" w:lineRule="auto"/>
+            </w:pPr>
+            <w:r>
+              <w:t>90.43</w:t>
             </w:r>
           </w:p>
         </w:tc>
@@ -11155,20 +11155,20 @@
               <w:spacing w:after="40" w:line="230" w:lineRule="auto"/>
             </w:pPr>
             <w:r>
-              <w:t>60.00</w:t>
-            </w:r>
-          </w:p>
-        </w:tc>
-        <w:tc>
-          <w:tcPr>
-            <w:tcW w:w="900" w:type="dxa"/>
-          </w:tcPr>
-          <w:p>
-            <w:pPr>
-              <w:spacing w:after="40" w:line="230" w:lineRule="auto"/>
-            </w:pPr>
-            <w:r>
-              <w:t>56.26</w:t>
+              <w:t>40.00</w:t>
+            </w:r>
+          </w:p>
+        </w:tc>
+        <w:tc>
+          <w:tcPr>
+            <w:tcW w:w="900" w:type="dxa"/>
+          </w:tcPr>
+          <w:p>
+            <w:pPr>
+              <w:spacing w:after="40" w:line="230" w:lineRule="auto"/>
+            </w:pPr>
+            <w:r>
+              <w:t>44.86</w:t>
             </w:r>
           </w:p>
         </w:tc>
@@ -11181,7 +11181,7 @@
               <w:spacing w:after="40" w:line="230" w:lineRule="auto"/>
             </w:pPr>
             <w:r>
-              <w:t>25/31</w:t>
+              <w:t>26/31</w:t>
             </w:r>
           </w:p>
         </w:tc>
@@ -11209,46 +11209,46 @@
               <w:spacing w:after="40" w:line="230" w:lineRule="auto"/>
             </w:pPr>
             <w:r>
-              <w:t>OpenAIRE Graph</w:t>
-            </w:r>
-          </w:p>
-        </w:tc>
-        <w:tc>
-          <w:tcPr>
-            <w:tcW w:w="700" w:type="dxa"/>
-          </w:tcPr>
-          <w:p>
-            <w:pPr>
-              <w:spacing w:after="40" w:line="230" w:lineRule="auto"/>
-            </w:pPr>
-            <w:r>
-              <w:t>59.67</w:t>
-            </w:r>
-          </w:p>
-        </w:tc>
-        <w:tc>
-          <w:tcPr>
-            <w:tcW w:w="700" w:type="dxa"/>
-          </w:tcPr>
-          <w:p>
-            <w:pPr>
-              <w:spacing w:after="40" w:line="230" w:lineRule="auto"/>
-            </w:pPr>
-            <w:r>
-              <w:t>53.21</w:t>
-            </w:r>
-          </w:p>
-        </w:tc>
-        <w:tc>
-          <w:tcPr>
-            <w:tcW w:w="900" w:type="dxa"/>
-          </w:tcPr>
-          <w:p>
-            <w:pPr>
-              <w:spacing w:after="40" w:line="230" w:lineRule="auto"/>
-            </w:pPr>
-            <w:r>
-              <w:t>90.43</w:t>
+              <w:t>Dryad</w:t>
+            </w:r>
+          </w:p>
+        </w:tc>
+        <w:tc>
+          <w:tcPr>
+            <w:tcW w:w="700" w:type="dxa"/>
+          </w:tcPr>
+          <w:p>
+            <w:pPr>
+              <w:spacing w:after="40" w:line="230" w:lineRule="auto"/>
+            </w:pPr>
+            <w:r>
+              <w:t>60.01</w:t>
+            </w:r>
+          </w:p>
+        </w:tc>
+        <w:tc>
+          <w:tcPr>
+            <w:tcW w:w="700" w:type="dxa"/>
+          </w:tcPr>
+          <w:p>
+            <w:pPr>
+              <w:spacing w:after="40" w:line="230" w:lineRule="auto"/>
+            </w:pPr>
+            <w:r>
+              <w:t>62.54</w:t>
+            </w:r>
+          </w:p>
+        </w:tc>
+        <w:tc>
+          <w:tcPr>
+            <w:tcW w:w="900" w:type="dxa"/>
+          </w:tcPr>
+          <w:p>
+            <w:pPr>
+              <w:spacing w:after="40" w:line="230" w:lineRule="auto"/>
+            </w:pPr>
+            <w:r>
+              <w:t>81.00</w:t>
             </w:r>
           </w:p>
         </w:tc>
@@ -11261,20 +11261,20 @@
               <w:spacing w:after="40" w:line="230" w:lineRule="auto"/>
             </w:pPr>
             <w:r>
-              <w:t>50.00</w:t>
-            </w:r>
-          </w:p>
-        </w:tc>
-        <w:tc>
-          <w:tcPr>
-            <w:tcW w:w="900" w:type="dxa"/>
-          </w:tcPr>
-          <w:p>
-            <w:pPr>
-              <w:spacing w:after="40" w:line="230" w:lineRule="auto"/>
-            </w:pPr>
-            <w:r>
-              <w:t>45.06</w:t>
+              <w:t>40.00</w:t>
+            </w:r>
+          </w:p>
+        </w:tc>
+        <w:tc>
+          <w:tcPr>
+            <w:tcW w:w="900" w:type="dxa"/>
+          </w:tcPr>
+          <w:p>
+            <w:pPr>
+              <w:spacing w:after="40" w:line="230" w:lineRule="auto"/>
+            </w:pPr>
+            <w:r>
+              <w:t>56.50</w:t>
             </w:r>
           </w:p>
         </w:tc>
@@ -11287,7 +11287,7 @@
               <w:spacing w:after="40" w:line="230" w:lineRule="auto"/>
             </w:pPr>
             <w:r>
-              <w:t>21/31</w:t>
+              <w:t>25/31</w:t>
             </w:r>
           </w:p>
         </w:tc>
@@ -11315,46 +11315,46 @@
               <w:spacing w:after="40" w:line="230" w:lineRule="auto"/>
             </w:pPr>
             <w:r>
-              <w:t>Episciences</w:t>
-            </w:r>
-          </w:p>
-        </w:tc>
-        <w:tc>
-          <w:tcPr>
-            <w:tcW w:w="700" w:type="dxa"/>
-          </w:tcPr>
-          <w:p>
-            <w:pPr>
-              <w:spacing w:after="40" w:line="230" w:lineRule="auto"/>
-            </w:pPr>
-            <w:r>
-              <w:t>59.48</w:t>
-            </w:r>
-          </w:p>
-        </w:tc>
-        <w:tc>
-          <w:tcPr>
-            <w:tcW w:w="700" w:type="dxa"/>
-          </w:tcPr>
-          <w:p>
-            <w:pPr>
-              <w:spacing w:after="40" w:line="230" w:lineRule="auto"/>
-            </w:pPr>
-            <w:r>
-              <w:t>33.33</w:t>
-            </w:r>
-          </w:p>
-        </w:tc>
-        <w:tc>
-          <w:tcPr>
-            <w:tcW w:w="900" w:type="dxa"/>
-          </w:tcPr>
-          <w:p>
-            <w:pPr>
-              <w:spacing w:after="40" w:line="230" w:lineRule="auto"/>
-            </w:pPr>
-            <w:r>
-              <w:t>78.57</w:t>
+              <w:t>Fulcrum</w:t>
+            </w:r>
+          </w:p>
+        </w:tc>
+        <w:tc>
+          <w:tcPr>
+            <w:tcW w:w="700" w:type="dxa"/>
+          </w:tcPr>
+          <w:p>
+            <w:pPr>
+              <w:spacing w:after="40" w:line="230" w:lineRule="auto"/>
+            </w:pPr>
+            <w:r>
+              <w:t>59.84</w:t>
+            </w:r>
+          </w:p>
+        </w:tc>
+        <w:tc>
+          <w:tcPr>
+            <w:tcW w:w="700" w:type="dxa"/>
+          </w:tcPr>
+          <w:p>
+            <w:pPr>
+              <w:spacing w:after="40" w:line="230" w:lineRule="auto"/>
+            </w:pPr>
+            <w:r>
+              <w:t>58.83</w:t>
+            </w:r>
+          </w:p>
+        </w:tc>
+        <w:tc>
+          <w:tcPr>
+            <w:tcW w:w="900" w:type="dxa"/>
+          </w:tcPr>
+          <w:p>
+            <w:pPr>
+              <w:spacing w:after="40" w:line="230" w:lineRule="auto"/>
+            </w:pPr>
+            <w:r>
+              <w:t>64.29</w:t>
             </w:r>
           </w:p>
         </w:tc>
@@ -11367,20 +11367,20 @@
               <w:spacing w:after="40" w:line="230" w:lineRule="auto"/>
             </w:pPr>
             <w:r>
-              <w:t>62.50</w:t>
-            </w:r>
-          </w:p>
-        </w:tc>
-        <w:tc>
-          <w:tcPr>
-            <w:tcW w:w="900" w:type="dxa"/>
-          </w:tcPr>
-          <w:p>
-            <w:pPr>
-              <w:spacing w:after="40" w:line="230" w:lineRule="auto"/>
-            </w:pPr>
-            <w:r>
-              <w:t>63.50</w:t>
+              <w:t>60.00</w:t>
+            </w:r>
+          </w:p>
+        </w:tc>
+        <w:tc>
+          <w:tcPr>
+            <w:tcW w:w="900" w:type="dxa"/>
+          </w:tcPr>
+          <w:p>
+            <w:pPr>
+              <w:spacing w:after="40" w:line="230" w:lineRule="auto"/>
+            </w:pPr>
+            <w:r>
+              <w:t>56.26</w:t>
             </w:r>
           </w:p>
         </w:tc>
@@ -11393,7 +11393,7 @@
               <w:spacing w:after="40" w:line="230" w:lineRule="auto"/>
             </w:pPr>
             <w:r>
-              <w:t>27/31</w:t>
+              <w:t>25/31</w:t>
             </w:r>
           </w:p>
         </w:tc>
@@ -11421,46 +11421,46 @@
               <w:spacing w:after="40" w:line="230" w:lineRule="auto"/>
             </w:pPr>
             <w:r>
-              <w:t>DART (Digital Archivist's Resource Tool)</w:t>
-            </w:r>
-          </w:p>
-        </w:tc>
-        <w:tc>
-          <w:tcPr>
-            <w:tcW w:w="700" w:type="dxa"/>
-          </w:tcPr>
-          <w:p>
-            <w:pPr>
-              <w:spacing w:after="40" w:line="230" w:lineRule="auto"/>
-            </w:pPr>
-            <w:r>
-              <w:t>59.08</w:t>
-            </w:r>
-          </w:p>
-        </w:tc>
-        <w:tc>
-          <w:tcPr>
-            <w:tcW w:w="700" w:type="dxa"/>
-          </w:tcPr>
-          <w:p>
-            <w:pPr>
-              <w:spacing w:after="40" w:line="230" w:lineRule="auto"/>
-            </w:pPr>
-            <w:r>
-              <w:t>60.13</w:t>
-            </w:r>
-          </w:p>
-        </w:tc>
-        <w:tc>
-          <w:tcPr>
-            <w:tcW w:w="900" w:type="dxa"/>
-          </w:tcPr>
-          <w:p>
-            <w:pPr>
-              <w:spacing w:after="40" w:line="230" w:lineRule="auto"/>
-            </w:pPr>
-            <w:r>
-              <w:t>81.00</w:t>
+              <w:t>OpenAIRE Graph</w:t>
+            </w:r>
+          </w:p>
+        </w:tc>
+        <w:tc>
+          <w:tcPr>
+            <w:tcW w:w="700" w:type="dxa"/>
+          </w:tcPr>
+          <w:p>
+            <w:pPr>
+              <w:spacing w:after="40" w:line="230" w:lineRule="auto"/>
+            </w:pPr>
+            <w:r>
+              <w:t>59.67</w:t>
+            </w:r>
+          </w:p>
+        </w:tc>
+        <w:tc>
+          <w:tcPr>
+            <w:tcW w:w="700" w:type="dxa"/>
+          </w:tcPr>
+          <w:p>
+            <w:pPr>
+              <w:spacing w:after="40" w:line="230" w:lineRule="auto"/>
+            </w:pPr>
+            <w:r>
+              <w:t>53.21</w:t>
+            </w:r>
+          </w:p>
+        </w:tc>
+        <w:tc>
+          <w:tcPr>
+            <w:tcW w:w="900" w:type="dxa"/>
+          </w:tcPr>
+          <w:p>
+            <w:pPr>
+              <w:spacing w:after="40" w:line="230" w:lineRule="auto"/>
+            </w:pPr>
+            <w:r>
+              <w:t>90.43</w:t>
             </w:r>
           </w:p>
         </w:tc>
@@ -11473,20 +11473,20 @@
               <w:spacing w:after="40" w:line="230" w:lineRule="auto"/>
             </w:pPr>
             <w:r>
-              <w:t>52.50</w:t>
-            </w:r>
-          </w:p>
-        </w:tc>
-        <w:tc>
-          <w:tcPr>
-            <w:tcW w:w="900" w:type="dxa"/>
-          </w:tcPr>
-          <w:p>
-            <w:pPr>
-              <w:spacing w:after="40" w:line="230" w:lineRule="auto"/>
-            </w:pPr>
-            <w:r>
-              <w:t>42.71</w:t>
+              <w:t>50.00</w:t>
+            </w:r>
+          </w:p>
+        </w:tc>
+        <w:tc>
+          <w:tcPr>
+            <w:tcW w:w="900" w:type="dxa"/>
+          </w:tcPr>
+          <w:p>
+            <w:pPr>
+              <w:spacing w:after="40" w:line="230" w:lineRule="auto"/>
+            </w:pPr>
+            <w:r>
+              <w:t>45.06</w:t>
             </w:r>
           </w:p>
         </w:tc>
@@ -11499,7 +11499,7 @@
               <w:spacing w:after="40" w:line="230" w:lineRule="auto"/>
             </w:pPr>
             <w:r>
-              <w:t>28/31</w:t>
+              <w:t>21/31</w:t>
             </w:r>
           </w:p>
         </w:tc>
@@ -11527,46 +11527,46 @@
               <w:spacing w:after="40" w:line="230" w:lineRule="auto"/>
             </w:pPr>
             <w:r>
-              <w:t>OpenCitations</w:t>
-            </w:r>
-          </w:p>
-        </w:tc>
-        <w:tc>
-          <w:tcPr>
-            <w:tcW w:w="700" w:type="dxa"/>
-          </w:tcPr>
-          <w:p>
-            <w:pPr>
-              <w:spacing w:after="40" w:line="230" w:lineRule="auto"/>
-            </w:pPr>
-            <w:r>
-              <w:t>58.78</w:t>
-            </w:r>
-          </w:p>
-        </w:tc>
-        <w:tc>
-          <w:tcPr>
-            <w:tcW w:w="700" w:type="dxa"/>
-          </w:tcPr>
-          <w:p>
-            <w:pPr>
-              <w:spacing w:after="40" w:line="230" w:lineRule="auto"/>
-            </w:pPr>
-            <w:r>
-              <w:t>65.40</w:t>
-            </w:r>
-          </w:p>
-        </w:tc>
-        <w:tc>
-          <w:tcPr>
-            <w:tcW w:w="900" w:type="dxa"/>
-          </w:tcPr>
-          <w:p>
-            <w:pPr>
-              <w:spacing w:after="40" w:line="230" w:lineRule="auto"/>
-            </w:pPr>
-            <w:r>
-              <w:t>80.86</w:t>
+              <w:t>Episciences</w:t>
+            </w:r>
+          </w:p>
+        </w:tc>
+        <w:tc>
+          <w:tcPr>
+            <w:tcW w:w="700" w:type="dxa"/>
+          </w:tcPr>
+          <w:p>
+            <w:pPr>
+              <w:spacing w:after="40" w:line="230" w:lineRule="auto"/>
+            </w:pPr>
+            <w:r>
+              <w:t>59.48</w:t>
+            </w:r>
+          </w:p>
+        </w:tc>
+        <w:tc>
+          <w:tcPr>
+            <w:tcW w:w="700" w:type="dxa"/>
+          </w:tcPr>
+          <w:p>
+            <w:pPr>
+              <w:spacing w:after="40" w:line="230" w:lineRule="auto"/>
+            </w:pPr>
+            <w:r>
+              <w:t>33.33</w:t>
+            </w:r>
+          </w:p>
+        </w:tc>
+        <w:tc>
+          <w:tcPr>
+            <w:tcW w:w="900" w:type="dxa"/>
+          </w:tcPr>
+          <w:p>
+            <w:pPr>
+              <w:spacing w:after="40" w:line="230" w:lineRule="auto"/>
+            </w:pPr>
+            <w:r>
+              <w:t>78.57</w:t>
             </w:r>
           </w:p>
         </w:tc>
@@ -11579,20 +11579,20 @@
               <w:spacing w:after="40" w:line="230" w:lineRule="auto"/>
             </w:pPr>
             <w:r>
-              <w:t>57.50</w:t>
-            </w:r>
-          </w:p>
-        </w:tc>
-        <w:tc>
-          <w:tcPr>
-            <w:tcW w:w="900" w:type="dxa"/>
-          </w:tcPr>
-          <w:p>
-            <w:pPr>
-              <w:spacing w:after="40" w:line="230" w:lineRule="auto"/>
-            </w:pPr>
-            <w:r>
-              <w:t>31.36</w:t>
+              <w:t>62.50</w:t>
+            </w:r>
+          </w:p>
+        </w:tc>
+        <w:tc>
+          <w:tcPr>
+            <w:tcW w:w="900" w:type="dxa"/>
+          </w:tcPr>
+          <w:p>
+            <w:pPr>
+              <w:spacing w:after="40" w:line="230" w:lineRule="auto"/>
+            </w:pPr>
+            <w:r>
+              <w:t>63.50</w:t>
             </w:r>
           </w:p>
         </w:tc>
@@ -11605,7 +11605,7 @@
               <w:spacing w:after="40" w:line="230" w:lineRule="auto"/>
             </w:pPr>
             <w:r>
-              <w:t>26/31</w:t>
+              <w:t>27/31</w:t>
             </w:r>
           </w:p>
         </w:tc>
@@ -11633,46 +11633,46 @@
               <w:spacing w:after="40" w:line="230" w:lineRule="auto"/>
             </w:pPr>
             <w:r>
-              <w:t>BitCurator Environment</w:t>
-            </w:r>
-          </w:p>
-        </w:tc>
-        <w:tc>
-          <w:tcPr>
-            <w:tcW w:w="700" w:type="dxa"/>
-          </w:tcPr>
-          <w:p>
-            <w:pPr>
-              <w:spacing w:after="40" w:line="230" w:lineRule="auto"/>
-            </w:pPr>
-            <w:r>
-              <w:t>58.59</w:t>
-            </w:r>
-          </w:p>
-        </w:tc>
-        <w:tc>
-          <w:tcPr>
-            <w:tcW w:w="700" w:type="dxa"/>
-          </w:tcPr>
-          <w:p>
-            <w:pPr>
-              <w:spacing w:after="40" w:line="230" w:lineRule="auto"/>
-            </w:pPr>
-            <w:r>
-              <w:t>76.57</w:t>
-            </w:r>
-          </w:p>
-        </w:tc>
-        <w:tc>
-          <w:tcPr>
-            <w:tcW w:w="900" w:type="dxa"/>
-          </w:tcPr>
-          <w:p>
-            <w:pPr>
-              <w:spacing w:after="40" w:line="230" w:lineRule="auto"/>
-            </w:pPr>
-            <w:r>
-              <w:t>90.43</w:t>
+              <w:t>DART (Digital Archivist's Resource Tool)</w:t>
+            </w:r>
+          </w:p>
+        </w:tc>
+        <w:tc>
+          <w:tcPr>
+            <w:tcW w:w="700" w:type="dxa"/>
+          </w:tcPr>
+          <w:p>
+            <w:pPr>
+              <w:spacing w:after="40" w:line="230" w:lineRule="auto"/>
+            </w:pPr>
+            <w:r>
+              <w:t>59.08</w:t>
+            </w:r>
+          </w:p>
+        </w:tc>
+        <w:tc>
+          <w:tcPr>
+            <w:tcW w:w="700" w:type="dxa"/>
+          </w:tcPr>
+          <w:p>
+            <w:pPr>
+              <w:spacing w:after="40" w:line="230" w:lineRule="auto"/>
+            </w:pPr>
+            <w:r>
+              <w:t>60.13</w:t>
+            </w:r>
+          </w:p>
+        </w:tc>
+        <w:tc>
+          <w:tcPr>
+            <w:tcW w:w="900" w:type="dxa"/>
+          </w:tcPr>
+          <w:p>
+            <w:pPr>
+              <w:spacing w:after="40" w:line="230" w:lineRule="auto"/>
+            </w:pPr>
+            <w:r>
+              <w:t>81.00</w:t>
             </w:r>
           </w:p>
         </w:tc>
@@ -11685,20 +11685,20 @@
               <w:spacing w:after="40" w:line="230" w:lineRule="auto"/>
             </w:pPr>
             <w:r>
-              <w:t>65.00</w:t>
-            </w:r>
-          </w:p>
-        </w:tc>
-        <w:tc>
-          <w:tcPr>
-            <w:tcW w:w="900" w:type="dxa"/>
-          </w:tcPr>
-          <w:p>
-            <w:pPr>
-              <w:spacing w:after="40" w:line="230" w:lineRule="auto"/>
-            </w:pPr>
-            <w:r>
-              <w:t>2.35</w:t>
+              <w:t>52.50</w:t>
+            </w:r>
+          </w:p>
+        </w:tc>
+        <w:tc>
+          <w:tcPr>
+            <w:tcW w:w="900" w:type="dxa"/>
+          </w:tcPr>
+          <w:p>
+            <w:pPr>
+              <w:spacing w:after="40" w:line="230" w:lineRule="auto"/>
+            </w:pPr>
+            <w:r>
+              <w:t>42.71</w:t>
             </w:r>
           </w:p>
         </w:tc>
@@ -11711,7 +11711,7 @@
               <w:spacing w:after="40" w:line="230" w:lineRule="auto"/>
             </w:pPr>
             <w:r>
-              <w:t>27/31</w:t>
+              <w:t>28/31</w:t>
             </w:r>
           </w:p>
         </w:tc>
@@ -11739,46 +11739,46 @@
               <w:spacing w:after="40" w:line="230" w:lineRule="auto"/>
             </w:pPr>
             <w:r>
-              <w:t>CORE</w:t>
-            </w:r>
-          </w:p>
-        </w:tc>
-        <w:tc>
-          <w:tcPr>
-            <w:tcW w:w="700" w:type="dxa"/>
-          </w:tcPr>
-          <w:p>
-            <w:pPr>
-              <w:spacing w:after="40" w:line="230" w:lineRule="auto"/>
-            </w:pPr>
-            <w:r>
-              <w:t>58.36</w:t>
-            </w:r>
-          </w:p>
-        </w:tc>
-        <w:tc>
-          <w:tcPr>
-            <w:tcW w:w="700" w:type="dxa"/>
-          </w:tcPr>
-          <w:p>
-            <w:pPr>
-              <w:spacing w:after="40" w:line="230" w:lineRule="auto"/>
-            </w:pPr>
-            <w:r>
-              <w:t>65.17</w:t>
-            </w:r>
-          </w:p>
-        </w:tc>
-        <w:tc>
-          <w:tcPr>
-            <w:tcW w:w="900" w:type="dxa"/>
-          </w:tcPr>
-          <w:p>
-            <w:pPr>
-              <w:spacing w:after="40" w:line="230" w:lineRule="auto"/>
-            </w:pPr>
-            <w:r>
-              <w:t>90.43</w:t>
+              <w:t>OpenCitations</w:t>
+            </w:r>
+          </w:p>
+        </w:tc>
+        <w:tc>
+          <w:tcPr>
+            <w:tcW w:w="700" w:type="dxa"/>
+          </w:tcPr>
+          <w:p>
+            <w:pPr>
+              <w:spacing w:after="40" w:line="230" w:lineRule="auto"/>
+            </w:pPr>
+            <w:r>
+              <w:t>58.78</w:t>
+            </w:r>
+          </w:p>
+        </w:tc>
+        <w:tc>
+          <w:tcPr>
+            <w:tcW w:w="700" w:type="dxa"/>
+          </w:tcPr>
+          <w:p>
+            <w:pPr>
+              <w:spacing w:after="40" w:line="230" w:lineRule="auto"/>
+            </w:pPr>
+            <w:r>
+              <w:t>65.40</w:t>
+            </w:r>
+          </w:p>
+        </w:tc>
+        <w:tc>
+          <w:tcPr>
+            <w:tcW w:w="900" w:type="dxa"/>
+          </w:tcPr>
+          <w:p>
+            <w:pPr>
+              <w:spacing w:after="40" w:line="230" w:lineRule="auto"/>
+            </w:pPr>
+            <w:r>
+              <w:t>80.86</w:t>
             </w:r>
           </w:p>
         </w:tc>
@@ -11791,20 +11791,20 @@
               <w:spacing w:after="40" w:line="230" w:lineRule="auto"/>
             </w:pPr>
             <w:r>
-              <w:t>40.00</w:t>
-            </w:r>
-          </w:p>
-        </w:tc>
-        <w:tc>
-          <w:tcPr>
-            <w:tcW w:w="900" w:type="dxa"/>
-          </w:tcPr>
-          <w:p>
-            <w:pPr>
-              <w:spacing w:after="40" w:line="230" w:lineRule="auto"/>
-            </w:pPr>
-            <w:r>
-              <w:t>37.86</w:t>
+              <w:t>57.50</w:t>
+            </w:r>
+          </w:p>
+        </w:tc>
+        <w:tc>
+          <w:tcPr>
+            <w:tcW w:w="900" w:type="dxa"/>
+          </w:tcPr>
+          <w:p>
+            <w:pPr>
+              <w:spacing w:after="40" w:line="230" w:lineRule="auto"/>
+            </w:pPr>
+            <w:r>
+              <w:t>31.36</w:t>
             </w:r>
           </w:p>
         </w:tc>
@@ -11817,7 +11817,7 @@
               <w:spacing w:after="40" w:line="230" w:lineRule="auto"/>
             </w:pPr>
             <w:r>
-              <w:t>22/31</w:t>
+              <w:t>26/31</w:t>
             </w:r>
           </w:p>
         </w:tc>
@@ -11845,46 +11845,46 @@
               <w:spacing w:after="40" w:line="230" w:lineRule="auto"/>
             </w:pPr>
             <w:r>
-              <w:t>Openverse</w:t>
-            </w:r>
-          </w:p>
-        </w:tc>
-        <w:tc>
-          <w:tcPr>
-            <w:tcW w:w="700" w:type="dxa"/>
-          </w:tcPr>
-          <w:p>
-            <w:pPr>
-              <w:spacing w:after="40" w:line="230" w:lineRule="auto"/>
-            </w:pPr>
-            <w:r>
-              <w:t>57.87</w:t>
-            </w:r>
-          </w:p>
-        </w:tc>
-        <w:tc>
-          <w:tcPr>
-            <w:tcW w:w="700" w:type="dxa"/>
-          </w:tcPr>
-          <w:p>
-            <w:pPr>
-              <w:spacing w:after="40" w:line="230" w:lineRule="auto"/>
-            </w:pPr>
-            <w:r>
-              <w:t>66.67</w:t>
-            </w:r>
-          </w:p>
-        </w:tc>
-        <w:tc>
-          <w:tcPr>
-            <w:tcW w:w="900" w:type="dxa"/>
-          </w:tcPr>
-          <w:p>
-            <w:pPr>
-              <w:spacing w:after="40" w:line="230" w:lineRule="auto"/>
-            </w:pPr>
-            <w:r>
-              <w:t>64.29</w:t>
+              <w:t>BitCurator Environment</w:t>
+            </w:r>
+          </w:p>
+        </w:tc>
+        <w:tc>
+          <w:tcPr>
+            <w:tcW w:w="700" w:type="dxa"/>
+          </w:tcPr>
+          <w:p>
+            <w:pPr>
+              <w:spacing w:after="40" w:line="230" w:lineRule="auto"/>
+            </w:pPr>
+            <w:r>
+              <w:t>58.59</w:t>
+            </w:r>
+          </w:p>
+        </w:tc>
+        <w:tc>
+          <w:tcPr>
+            <w:tcW w:w="700" w:type="dxa"/>
+          </w:tcPr>
+          <w:p>
+            <w:pPr>
+              <w:spacing w:after="40" w:line="230" w:lineRule="auto"/>
+            </w:pPr>
+            <w:r>
+              <w:t>76.57</w:t>
+            </w:r>
+          </w:p>
+        </w:tc>
+        <w:tc>
+          <w:tcPr>
+            <w:tcW w:w="900" w:type="dxa"/>
+          </w:tcPr>
+          <w:p>
+            <w:pPr>
+              <w:spacing w:after="40" w:line="230" w:lineRule="auto"/>
+            </w:pPr>
+            <w:r>
+              <w:t>90.43</w:t>
             </w:r>
           </w:p>
         </w:tc>
@@ -11897,20 +11897,20 @@
               <w:spacing w:after="40" w:line="230" w:lineRule="auto"/>
             </w:pPr>
             <w:r>
-              <w:t>55.00</w:t>
-            </w:r>
-          </w:p>
-        </w:tc>
-        <w:tc>
-          <w:tcPr>
-            <w:tcW w:w="900" w:type="dxa"/>
-          </w:tcPr>
-          <w:p>
-            <w:pPr>
-              <w:spacing w:after="40" w:line="230" w:lineRule="auto"/>
-            </w:pPr>
-            <w:r>
-              <w:t>45.53</w:t>
+              <w:t>65.00</w:t>
+            </w:r>
+          </w:p>
+        </w:tc>
+        <w:tc>
+          <w:tcPr>
+            <w:tcW w:w="900" w:type="dxa"/>
+          </w:tcPr>
+          <w:p>
+            <w:pPr>
+              <w:spacing w:after="40" w:line="230" w:lineRule="auto"/>
+            </w:pPr>
+            <w:r>
+              <w:t>2.35</w:t>
             </w:r>
           </w:p>
         </w:tc>
@@ -11923,7 +11923,7 @@
               <w:spacing w:after="40" w:line="230" w:lineRule="auto"/>
             </w:pPr>
             <w:r>
-              <w:t>28/31</w:t>
+              <w:t>27/31</w:t>
             </w:r>
           </w:p>
         </w:tc>
@@ -11951,46 +11951,46 @@
               <w:spacing w:after="40" w:line="230" w:lineRule="auto"/>
             </w:pPr>
             <w:r>
-              <w:t>Creative Commons Licenses</w:t>
-            </w:r>
-          </w:p>
-        </w:tc>
-        <w:tc>
-          <w:tcPr>
-            <w:tcW w:w="700" w:type="dxa"/>
-          </w:tcPr>
-          <w:p>
-            <w:pPr>
-              <w:spacing w:after="40" w:line="230" w:lineRule="auto"/>
-            </w:pPr>
-            <w:r>
-              <w:t>57.55</w:t>
-            </w:r>
-          </w:p>
-        </w:tc>
-        <w:tc>
-          <w:tcPr>
-            <w:tcW w:w="700" w:type="dxa"/>
-          </w:tcPr>
-          <w:p>
-            <w:pPr>
-              <w:spacing w:after="40" w:line="230" w:lineRule="auto"/>
-            </w:pPr>
-            <w:r>
-              <w:t>77.35</w:t>
-            </w:r>
-          </w:p>
-        </w:tc>
-        <w:tc>
-          <w:tcPr>
-            <w:tcW w:w="900" w:type="dxa"/>
-          </w:tcPr>
-          <w:p>
-            <w:pPr>
-              <w:spacing w:after="40" w:line="230" w:lineRule="auto"/>
-            </w:pPr>
-            <w:r>
-              <w:t>57.14</w:t>
+              <w:t>Openverse</w:t>
+            </w:r>
+          </w:p>
+        </w:tc>
+        <w:tc>
+          <w:tcPr>
+            <w:tcW w:w="700" w:type="dxa"/>
+          </w:tcPr>
+          <w:p>
+            <w:pPr>
+              <w:spacing w:after="40" w:line="230" w:lineRule="auto"/>
+            </w:pPr>
+            <w:r>
+              <w:t>57.87</w:t>
+            </w:r>
+          </w:p>
+        </w:tc>
+        <w:tc>
+          <w:tcPr>
+            <w:tcW w:w="700" w:type="dxa"/>
+          </w:tcPr>
+          <w:p>
+            <w:pPr>
+              <w:spacing w:after="40" w:line="230" w:lineRule="auto"/>
+            </w:pPr>
+            <w:r>
+              <w:t>66.67</w:t>
+            </w:r>
+          </w:p>
+        </w:tc>
+        <w:tc>
+          <w:tcPr>
+            <w:tcW w:w="900" w:type="dxa"/>
+          </w:tcPr>
+          <w:p>
+            <w:pPr>
+              <w:spacing w:after="40" w:line="230" w:lineRule="auto"/>
+            </w:pPr>
+            <w:r>
+              <w:t>64.29</w:t>
             </w:r>
           </w:p>
         </w:tc>
@@ -12003,20 +12003,20 @@
               <w:spacing w:after="40" w:line="230" w:lineRule="auto"/>
             </w:pPr>
             <w:r>
-              <w:t>37.78</w:t>
-            </w:r>
-          </w:p>
-        </w:tc>
-        <w:tc>
-          <w:tcPr>
-            <w:tcW w:w="900" w:type="dxa"/>
-          </w:tcPr>
-          <w:p>
-            <w:pPr>
-              <w:spacing w:after="40" w:line="230" w:lineRule="auto"/>
-            </w:pPr>
-            <w:r>
-              <w:t>57.92</w:t>
+              <w:t>55.00</w:t>
+            </w:r>
+          </w:p>
+        </w:tc>
+        <w:tc>
+          <w:tcPr>
+            <w:tcW w:w="900" w:type="dxa"/>
+          </w:tcPr>
+          <w:p>
+            <w:pPr>
+              <w:spacing w:after="40" w:line="230" w:lineRule="auto"/>
+            </w:pPr>
+            <w:r>
+              <w:t>45.53</w:t>
             </w:r>
           </w:p>
         </w:tc>
@@ -12029,7 +12029,7 @@
               <w:spacing w:after="40" w:line="230" w:lineRule="auto"/>
             </w:pPr>
             <w:r>
-              <w:t>27/31</w:t>
+              <w:t>28/31</w:t>
             </w:r>
           </w:p>
         </w:tc>
@@ -12057,46 +12057,46 @@
               <w:spacing w:after="40" w:line="230" w:lineRule="auto"/>
             </w:pPr>
             <w:r>
-              <w:t>Tropy</w:t>
-            </w:r>
-          </w:p>
-        </w:tc>
-        <w:tc>
-          <w:tcPr>
-            <w:tcW w:w="700" w:type="dxa"/>
-          </w:tcPr>
-          <w:p>
-            <w:pPr>
-              <w:spacing w:after="40" w:line="230" w:lineRule="auto"/>
-            </w:pPr>
-            <w:r>
-              <w:t>57.53</w:t>
-            </w:r>
-          </w:p>
-        </w:tc>
-        <w:tc>
-          <w:tcPr>
-            <w:tcW w:w="700" w:type="dxa"/>
-          </w:tcPr>
-          <w:p>
-            <w:pPr>
-              <w:spacing w:after="40" w:line="230" w:lineRule="auto"/>
-            </w:pPr>
-            <w:r>
-              <w:t>52.86</w:t>
-            </w:r>
-          </w:p>
-        </w:tc>
-        <w:tc>
-          <w:tcPr>
-            <w:tcW w:w="900" w:type="dxa"/>
-          </w:tcPr>
-          <w:p>
-            <w:pPr>
-              <w:spacing w:after="40" w:line="230" w:lineRule="auto"/>
-            </w:pPr>
-            <w:r>
-              <w:t>73.71</w:t>
+              <w:t>Creative Commons Licenses</w:t>
+            </w:r>
+          </w:p>
+        </w:tc>
+        <w:tc>
+          <w:tcPr>
+            <w:tcW w:w="700" w:type="dxa"/>
+          </w:tcPr>
+          <w:p>
+            <w:pPr>
+              <w:spacing w:after="40" w:line="230" w:lineRule="auto"/>
+            </w:pPr>
+            <w:r>
+              <w:t>57.55</w:t>
+            </w:r>
+          </w:p>
+        </w:tc>
+        <w:tc>
+          <w:tcPr>
+            <w:tcW w:w="700" w:type="dxa"/>
+          </w:tcPr>
+          <w:p>
+            <w:pPr>
+              <w:spacing w:after="40" w:line="230" w:lineRule="auto"/>
+            </w:pPr>
+            <w:r>
+              <w:t>77.35</w:t>
+            </w:r>
+          </w:p>
+        </w:tc>
+        <w:tc>
+          <w:tcPr>
+            <w:tcW w:w="900" w:type="dxa"/>
+          </w:tcPr>
+          <w:p>
+            <w:pPr>
+              <w:spacing w:after="40" w:line="230" w:lineRule="auto"/>
+            </w:pPr>
+            <w:r>
+              <w:t>57.14</w:t>
             </w:r>
           </w:p>
         </w:tc>
@@ -12109,20 +12109,20 @@
               <w:spacing w:after="40" w:line="230" w:lineRule="auto"/>
             </w:pPr>
             <w:r>
-              <w:t>40.00</w:t>
-            </w:r>
-          </w:p>
-        </w:tc>
-        <w:tc>
-          <w:tcPr>
-            <w:tcW w:w="900" w:type="dxa"/>
-          </w:tcPr>
-          <w:p>
-            <w:pPr>
-              <w:spacing w:after="40" w:line="230" w:lineRule="auto"/>
-            </w:pPr>
-            <w:r>
-              <w:t>63.56</w:t>
+              <w:t>37.78</w:t>
+            </w:r>
+          </w:p>
+        </w:tc>
+        <w:tc>
+          <w:tcPr>
+            <w:tcW w:w="900" w:type="dxa"/>
+          </w:tcPr>
+          <w:p>
+            <w:pPr>
+              <w:spacing w:after="40" w:line="230" w:lineRule="auto"/>
+            </w:pPr>
+            <w:r>
+              <w:t>57.92</w:t>
             </w:r>
           </w:p>
         </w:tc>
@@ -12135,7 +12135,7 @@
               <w:spacing w:after="40" w:line="230" w:lineRule="auto"/>
             </w:pPr>
             <w:r>
-              <w:t>29/31</w:t>
+              <w:t>27/31</w:t>
             </w:r>
           </w:p>
         </w:tc>
@@ -12163,46 +12163,46 @@
               <w:spacing w:after="40" w:line="230" w:lineRule="auto"/>
             </w:pPr>
             <w:r>
-              <w:t>COUNTER Code of Practice</w:t>
-            </w:r>
-          </w:p>
-        </w:tc>
-        <w:tc>
-          <w:tcPr>
-            <w:tcW w:w="700" w:type="dxa"/>
-          </w:tcPr>
-          <w:p>
-            <w:pPr>
-              <w:spacing w:after="40" w:line="230" w:lineRule="auto"/>
-            </w:pPr>
-            <w:r>
-              <w:t>57.19</w:t>
-            </w:r>
-          </w:p>
-        </w:tc>
-        <w:tc>
-          <w:tcPr>
-            <w:tcW w:w="700" w:type="dxa"/>
-          </w:tcPr>
-          <w:p>
-            <w:pPr>
-              <w:spacing w:after="40" w:line="230" w:lineRule="auto"/>
-            </w:pPr>
-            <w:r>
-              <w:t>70.80</w:t>
-            </w:r>
-          </w:p>
-        </w:tc>
-        <w:tc>
-          <w:tcPr>
-            <w:tcW w:w="900" w:type="dxa"/>
-          </w:tcPr>
-          <w:p>
-            <w:pPr>
-              <w:spacing w:after="40" w:line="230" w:lineRule="auto"/>
-            </w:pPr>
-            <w:r>
-              <w:t>95.29</w:t>
+              <w:t>Tropy</w:t>
+            </w:r>
+          </w:p>
+        </w:tc>
+        <w:tc>
+          <w:tcPr>
+            <w:tcW w:w="700" w:type="dxa"/>
+          </w:tcPr>
+          <w:p>
+            <w:pPr>
+              <w:spacing w:after="40" w:line="230" w:lineRule="auto"/>
+            </w:pPr>
+            <w:r>
+              <w:t>57.53</w:t>
+            </w:r>
+          </w:p>
+        </w:tc>
+        <w:tc>
+          <w:tcPr>
+            <w:tcW w:w="700" w:type="dxa"/>
+          </w:tcPr>
+          <w:p>
+            <w:pPr>
+              <w:spacing w:after="40" w:line="230" w:lineRule="auto"/>
+            </w:pPr>
+            <w:r>
+              <w:t>52.86</w:t>
+            </w:r>
+          </w:p>
+        </w:tc>
+        <w:tc>
+          <w:tcPr>
+            <w:tcW w:w="900" w:type="dxa"/>
+          </w:tcPr>
+          <w:p>
+            <w:pPr>
+              <w:spacing w:after="40" w:line="230" w:lineRule="auto"/>
+            </w:pPr>
+            <w:r>
+              <w:t>73.71</w:t>
             </w:r>
           </w:p>
         </w:tc>
@@ -12228,7 +12228,7 @@
               <w:spacing w:after="40" w:line="230" w:lineRule="auto"/>
             </w:pPr>
             <w:r>
-              <w:t>22.70</w:t>
+              <w:t>63.56</w:t>
             </w:r>
           </w:p>
         </w:tc>
@@ -12241,7 +12241,7 @@
               <w:spacing w:after="40" w:line="230" w:lineRule="auto"/>
             </w:pPr>
             <w:r>
-              <w:t>22/31</w:t>
+              <w:t>29/31</w:t>
             </w:r>
           </w:p>
         </w:tc>
@@ -14679,7 +14679,7 @@
               <w:spacing w:after="40" w:line="230" w:lineRule="auto"/>
             </w:pPr>
             <w:r>
-              <w:t>14/31</w:t>
+              <w:t>21/31</w:t>
             </w:r>
           </w:p>
         </w:tc>
@@ -15449,46 +15449,46 @@
               <w:spacing w:after="40" w:line="230" w:lineRule="auto"/>
             </w:pPr>
             <w:r>
-              <w:t>LA Referencia</w:t>
-            </w:r>
-          </w:p>
-        </w:tc>
-        <w:tc>
-          <w:tcPr>
-            <w:tcW w:w="700" w:type="dxa"/>
-          </w:tcPr>
-          <w:p>
-            <w:pPr>
-              <w:spacing w:after="40" w:line="230" w:lineRule="auto"/>
-            </w:pPr>
-            <w:r>
-              <w:t>45.70</w:t>
-            </w:r>
-          </w:p>
-        </w:tc>
-        <w:tc>
-          <w:tcPr>
-            <w:tcW w:w="700" w:type="dxa"/>
-          </w:tcPr>
-          <w:p>
-            <w:pPr>
-              <w:spacing w:after="40" w:line="230" w:lineRule="auto"/>
-            </w:pPr>
-            <w:r>
-              <w:t>33.33</w:t>
-            </w:r>
-          </w:p>
-        </w:tc>
-        <w:tc>
-          <w:tcPr>
-            <w:tcW w:w="900" w:type="dxa"/>
-          </w:tcPr>
-          <w:p>
-            <w:pPr>
-              <w:spacing w:after="40" w:line="230" w:lineRule="auto"/>
-            </w:pPr>
-            <w:r>
-              <w:t>61.86</w:t>
+              <w:t>Archival Resource Key</w:t>
+            </w:r>
+          </w:p>
+        </w:tc>
+        <w:tc>
+          <w:tcPr>
+            <w:tcW w:w="700" w:type="dxa"/>
+          </w:tcPr>
+          <w:p>
+            <w:pPr>
+              <w:spacing w:after="40" w:line="230" w:lineRule="auto"/>
+            </w:pPr>
+            <w:r>
+              <w:t>45.79</w:t>
+            </w:r>
+          </w:p>
+        </w:tc>
+        <w:tc>
+          <w:tcPr>
+            <w:tcW w:w="700" w:type="dxa"/>
+          </w:tcPr>
+          <w:p>
+            <w:pPr>
+              <w:spacing w:after="40" w:line="230" w:lineRule="auto"/>
+            </w:pPr>
+            <w:r>
+              <w:t>67.59</w:t>
+            </w:r>
+          </w:p>
+        </w:tc>
+        <w:tc>
+          <w:tcPr>
+            <w:tcW w:w="900" w:type="dxa"/>
+          </w:tcPr>
+          <w:p>
+            <w:pPr>
+              <w:spacing w:after="40" w:line="230" w:lineRule="auto"/>
+            </w:pPr>
+            <w:r>
+              <w:t>45.29</w:t>
             </w:r>
           </w:p>
         </w:tc>
@@ -15501,20 +15501,20 @@
               <w:spacing w:after="40" w:line="230" w:lineRule="auto"/>
             </w:pPr>
             <w:r>
-              <w:t>40.00</w:t>
-            </w:r>
-          </w:p>
-        </w:tc>
-        <w:tc>
-          <w:tcPr>
-            <w:tcW w:w="900" w:type="dxa"/>
-          </w:tcPr>
-          <w:p>
-            <w:pPr>
-              <w:spacing w:after="40" w:line="230" w:lineRule="auto"/>
-            </w:pPr>
-            <w:r>
-              <w:t>47.62</w:t>
+              <w:t>31.11</w:t>
+            </w:r>
+          </w:p>
+        </w:tc>
+        <w:tc>
+          <w:tcPr>
+            <w:tcW w:w="900" w:type="dxa"/>
+          </w:tcPr>
+          <w:p>
+            <w:pPr>
+              <w:spacing w:after="40" w:line="230" w:lineRule="auto"/>
+            </w:pPr>
+            <w:r>
+              <w:t>39.17</w:t>
             </w:r>
           </w:p>
         </w:tc>
@@ -15527,7 +15527,7 @@
               <w:spacing w:after="40" w:line="230" w:lineRule="auto"/>
             </w:pPr>
             <w:r>
-              <w:t>22/31</w:t>
+              <w:t>23/31</w:t>
             </w:r>
           </w:p>
         </w:tc>
@@ -15555,46 +15555,46 @@
               <w:spacing w:after="40" w:line="230" w:lineRule="auto"/>
             </w:pPr>
             <w:r>
-              <w:t>COAR Notify</w:t>
-            </w:r>
-          </w:p>
-        </w:tc>
-        <w:tc>
-          <w:tcPr>
-            <w:tcW w:w="700" w:type="dxa"/>
-          </w:tcPr>
-          <w:p>
-            <w:pPr>
-              <w:spacing w:after="40" w:line="230" w:lineRule="auto"/>
-            </w:pPr>
-            <w:r>
-              <w:t>45.27</w:t>
-            </w:r>
-          </w:p>
-        </w:tc>
-        <w:tc>
-          <w:tcPr>
-            <w:tcW w:w="700" w:type="dxa"/>
-          </w:tcPr>
-          <w:p>
-            <w:pPr>
-              <w:spacing w:after="40" w:line="230" w:lineRule="auto"/>
-            </w:pPr>
-            <w:r>
-              <w:t>62.84</w:t>
-            </w:r>
-          </w:p>
-        </w:tc>
-        <w:tc>
-          <w:tcPr>
-            <w:tcW w:w="900" w:type="dxa"/>
-          </w:tcPr>
-          <w:p>
-            <w:pPr>
-              <w:spacing w:after="40" w:line="230" w:lineRule="auto"/>
-            </w:pPr>
-            <w:r>
-              <w:t>40.43</w:t>
+              <w:t>LA Referencia</w:t>
+            </w:r>
+          </w:p>
+        </w:tc>
+        <w:tc>
+          <w:tcPr>
+            <w:tcW w:w="700" w:type="dxa"/>
+          </w:tcPr>
+          <w:p>
+            <w:pPr>
+              <w:spacing w:after="40" w:line="230" w:lineRule="auto"/>
+            </w:pPr>
+            <w:r>
+              <w:t>45.70</w:t>
+            </w:r>
+          </w:p>
+        </w:tc>
+        <w:tc>
+          <w:tcPr>
+            <w:tcW w:w="700" w:type="dxa"/>
+          </w:tcPr>
+          <w:p>
+            <w:pPr>
+              <w:spacing w:after="40" w:line="230" w:lineRule="auto"/>
+            </w:pPr>
+            <w:r>
+              <w:t>33.33</w:t>
+            </w:r>
+          </w:p>
+        </w:tc>
+        <w:tc>
+          <w:tcPr>
+            <w:tcW w:w="900" w:type="dxa"/>
+          </w:tcPr>
+          <w:p>
+            <w:pPr>
+              <w:spacing w:after="40" w:line="230" w:lineRule="auto"/>
+            </w:pPr>
+            <w:r>
+              <w:t>61.86</w:t>
             </w:r>
           </w:p>
         </w:tc>
@@ -15607,20 +15607,20 @@
               <w:spacing w:after="40" w:line="230" w:lineRule="auto"/>
             </w:pPr>
             <w:r>
-              <w:t>60.00</w:t>
-            </w:r>
-          </w:p>
-        </w:tc>
-        <w:tc>
-          <w:tcPr>
-            <w:tcW w:w="900" w:type="dxa"/>
-          </w:tcPr>
-          <w:p>
-            <w:pPr>
-              <w:spacing w:after="40" w:line="230" w:lineRule="auto"/>
-            </w:pPr>
-            <w:r>
-              <w:t>17.81</w:t>
+              <w:t>40.00</w:t>
+            </w:r>
+          </w:p>
+        </w:tc>
+        <w:tc>
+          <w:tcPr>
+            <w:tcW w:w="900" w:type="dxa"/>
+          </w:tcPr>
+          <w:p>
+            <w:pPr>
+              <w:spacing w:after="40" w:line="230" w:lineRule="auto"/>
+            </w:pPr>
+            <w:r>
+              <w:t>47.62</w:t>
             </w:r>
           </w:p>
         </w:tc>
@@ -15633,7 +15633,7 @@
               <w:spacing w:after="40" w:line="230" w:lineRule="auto"/>
             </w:pPr>
             <w:r>
-              <w:t>26/31</w:t>
+              <w:t>22/31</w:t>
             </w:r>
           </w:p>
         </w:tc>
@@ -15661,46 +15661,46 @@
               <w:spacing w:after="40" w:line="230" w:lineRule="auto"/>
             </w:pPr>
             <w:r>
-              <w:t>International Generic Sample Number (IGSN)</w:t>
-            </w:r>
-          </w:p>
-        </w:tc>
-        <w:tc>
-          <w:tcPr>
-            <w:tcW w:w="700" w:type="dxa"/>
-          </w:tcPr>
-          <w:p>
-            <w:pPr>
-              <w:spacing w:after="40" w:line="230" w:lineRule="auto"/>
-            </w:pPr>
-            <w:r>
-              <w:t>45.17</w:t>
-            </w:r>
-          </w:p>
-        </w:tc>
-        <w:tc>
-          <w:tcPr>
-            <w:tcW w:w="700" w:type="dxa"/>
-          </w:tcPr>
-          <w:p>
-            <w:pPr>
-              <w:spacing w:after="40" w:line="230" w:lineRule="auto"/>
-            </w:pPr>
-            <w:r>
-              <w:t>38.83</w:t>
-            </w:r>
-          </w:p>
-        </w:tc>
-        <w:tc>
-          <w:tcPr>
-            <w:tcW w:w="900" w:type="dxa"/>
-          </w:tcPr>
-          <w:p>
-            <w:pPr>
-              <w:spacing w:after="40" w:line="230" w:lineRule="auto"/>
-            </w:pPr>
-            <w:r>
-              <w:t>61.86</w:t>
+              <w:t>COAR Notify</w:t>
+            </w:r>
+          </w:p>
+        </w:tc>
+        <w:tc>
+          <w:tcPr>
+            <w:tcW w:w="700" w:type="dxa"/>
+          </w:tcPr>
+          <w:p>
+            <w:pPr>
+              <w:spacing w:after="40" w:line="230" w:lineRule="auto"/>
+            </w:pPr>
+            <w:r>
+              <w:t>45.27</w:t>
+            </w:r>
+          </w:p>
+        </w:tc>
+        <w:tc>
+          <w:tcPr>
+            <w:tcW w:w="700" w:type="dxa"/>
+          </w:tcPr>
+          <w:p>
+            <w:pPr>
+              <w:spacing w:after="40" w:line="230" w:lineRule="auto"/>
+            </w:pPr>
+            <w:r>
+              <w:t>62.84</w:t>
+            </w:r>
+          </w:p>
+        </w:tc>
+        <w:tc>
+          <w:tcPr>
+            <w:tcW w:w="900" w:type="dxa"/>
+          </w:tcPr>
+          <w:p>
+            <w:pPr>
+              <w:spacing w:after="40" w:line="230" w:lineRule="auto"/>
+            </w:pPr>
+            <w:r>
+              <w:t>40.43</w:t>
             </w:r>
           </w:p>
         </w:tc>
@@ -15713,20 +15713,20 @@
               <w:spacing w:after="40" w:line="230" w:lineRule="auto"/>
             </w:pPr>
             <w:r>
-              <w:t>80.00</w:t>
-            </w:r>
-          </w:p>
-        </w:tc>
-        <w:tc>
-          <w:tcPr>
-            <w:tcW w:w="900" w:type="dxa"/>
-          </w:tcPr>
-          <w:p>
-            <w:pPr>
-              <w:spacing w:after="40" w:line="230" w:lineRule="auto"/>
-            </w:pPr>
-            <w:r>
-              <w:t>0.00</w:t>
+              <w:t>60.00</w:t>
+            </w:r>
+          </w:p>
+        </w:tc>
+        <w:tc>
+          <w:tcPr>
+            <w:tcW w:w="900" w:type="dxa"/>
+          </w:tcPr>
+          <w:p>
+            <w:pPr>
+              <w:spacing w:after="40" w:line="230" w:lineRule="auto"/>
+            </w:pPr>
+            <w:r>
+              <w:t>17.81</w:t>
             </w:r>
           </w:p>
         </w:tc>
@@ -15739,7 +15739,7 @@
               <w:spacing w:after="40" w:line="230" w:lineRule="auto"/>
             </w:pPr>
             <w:r>
-              <w:t>14/31</w:t>
+              <w:t>26/31</w:t>
             </w:r>
           </w:p>
         </w:tc>
@@ -15767,46 +15767,46 @@
               <w:spacing w:after="40" w:line="230" w:lineRule="auto"/>
             </w:pPr>
             <w:r>
-              <w:t>FAIR Wizard</w:t>
-            </w:r>
-          </w:p>
-        </w:tc>
-        <w:tc>
-          <w:tcPr>
-            <w:tcW w:w="700" w:type="dxa"/>
-          </w:tcPr>
-          <w:p>
-            <w:pPr>
-              <w:spacing w:after="40" w:line="230" w:lineRule="auto"/>
-            </w:pPr>
-            <w:r>
-              <w:t>43.24</w:t>
-            </w:r>
-          </w:p>
-        </w:tc>
-        <w:tc>
-          <w:tcPr>
-            <w:tcW w:w="700" w:type="dxa"/>
-          </w:tcPr>
-          <w:p>
-            <w:pPr>
-              <w:spacing w:after="40" w:line="230" w:lineRule="auto"/>
-            </w:pPr>
-            <w:r>
-              <w:t>37.27</w:t>
-            </w:r>
-          </w:p>
-        </w:tc>
-        <w:tc>
-          <w:tcPr>
-            <w:tcW w:w="900" w:type="dxa"/>
-          </w:tcPr>
-          <w:p>
-            <w:pPr>
-              <w:spacing w:after="40" w:line="230" w:lineRule="auto"/>
-            </w:pPr>
-            <w:r>
-              <w:t>45.29</w:t>
+              <w:t>International Generic Sample Number (IGSN)</w:t>
+            </w:r>
+          </w:p>
+        </w:tc>
+        <w:tc>
+          <w:tcPr>
+            <w:tcW w:w="700" w:type="dxa"/>
+          </w:tcPr>
+          <w:p>
+            <w:pPr>
+              <w:spacing w:after="40" w:line="230" w:lineRule="auto"/>
+            </w:pPr>
+            <w:r>
+              <w:t>45.17</w:t>
+            </w:r>
+          </w:p>
+        </w:tc>
+        <w:tc>
+          <w:tcPr>
+            <w:tcW w:w="700" w:type="dxa"/>
+          </w:tcPr>
+          <w:p>
+            <w:pPr>
+              <w:spacing w:after="40" w:line="230" w:lineRule="auto"/>
+            </w:pPr>
+            <w:r>
+              <w:t>38.83</w:t>
+            </w:r>
+          </w:p>
+        </w:tc>
+        <w:tc>
+          <w:tcPr>
+            <w:tcW w:w="900" w:type="dxa"/>
+          </w:tcPr>
+          <w:p>
+            <w:pPr>
+              <w:spacing w:after="40" w:line="230" w:lineRule="auto"/>
+            </w:pPr>
+            <w:r>
+              <w:t>61.86</w:t>
             </w:r>
           </w:p>
         </w:tc>
@@ -15819,20 +15819,20 @@
               <w:spacing w:after="40" w:line="230" w:lineRule="auto"/>
             </w:pPr>
             <w:r>
-              <w:t>72.50</w:t>
-            </w:r>
-          </w:p>
-        </w:tc>
-        <w:tc>
-          <w:tcPr>
-            <w:tcW w:w="900" w:type="dxa"/>
-          </w:tcPr>
-          <w:p>
-            <w:pPr>
-              <w:spacing w:after="40" w:line="230" w:lineRule="auto"/>
-            </w:pPr>
-            <w:r>
-              <w:t>17.92</w:t>
+              <w:t>80.00</w:t>
+            </w:r>
+          </w:p>
+        </w:tc>
+        <w:tc>
+          <w:tcPr>
+            <w:tcW w:w="900" w:type="dxa"/>
+          </w:tcPr>
+          <w:p>
+            <w:pPr>
+              <w:spacing w:after="40" w:line="230" w:lineRule="auto"/>
+            </w:pPr>
+            <w:r>
+              <w:t>0.00</w:t>
             </w:r>
           </w:p>
         </w:tc>
@@ -15845,7 +15845,7 @@
               <w:spacing w:after="40" w:line="230" w:lineRule="auto"/>
             </w:pPr>
             <w:r>
-              <w:t>23/31</w:t>
+              <w:t>14/31</w:t>
             </w:r>
           </w:p>
         </w:tc>
@@ -15873,46 +15873,46 @@
               <w:spacing w:after="40" w:line="230" w:lineRule="auto"/>
             </w:pPr>
             <w:r>
-              <w:t>BrCRIS</w:t>
-            </w:r>
-          </w:p>
-        </w:tc>
-        <w:tc>
-          <w:tcPr>
-            <w:tcW w:w="700" w:type="dxa"/>
-          </w:tcPr>
-          <w:p>
-            <w:pPr>
-              <w:spacing w:after="40" w:line="230" w:lineRule="auto"/>
-            </w:pPr>
-            <w:r>
-              <w:t>42.52</w:t>
-            </w:r>
-          </w:p>
-        </w:tc>
-        <w:tc>
-          <w:tcPr>
-            <w:tcW w:w="700" w:type="dxa"/>
-          </w:tcPr>
-          <w:p>
-            <w:pPr>
-              <w:spacing w:after="40" w:line="230" w:lineRule="auto"/>
-            </w:pPr>
-            <w:r>
-              <w:t>44.50</w:t>
-            </w:r>
-          </w:p>
-        </w:tc>
-        <w:tc>
-          <w:tcPr>
-            <w:tcW w:w="900" w:type="dxa"/>
-          </w:tcPr>
-          <w:p>
-            <w:pPr>
-              <w:spacing w:after="40" w:line="230" w:lineRule="auto"/>
-            </w:pPr>
-            <w:r>
-              <w:t>50.00</w:t>
+              <w:t>FAIR Wizard</w:t>
+            </w:r>
+          </w:p>
+        </w:tc>
+        <w:tc>
+          <w:tcPr>
+            <w:tcW w:w="700" w:type="dxa"/>
+          </w:tcPr>
+          <w:p>
+            <w:pPr>
+              <w:spacing w:after="40" w:line="230" w:lineRule="auto"/>
+            </w:pPr>
+            <w:r>
+              <w:t>43.24</w:t>
+            </w:r>
+          </w:p>
+        </w:tc>
+        <w:tc>
+          <w:tcPr>
+            <w:tcW w:w="700" w:type="dxa"/>
+          </w:tcPr>
+          <w:p>
+            <w:pPr>
+              <w:spacing w:after="40" w:line="230" w:lineRule="auto"/>
+            </w:pPr>
+            <w:r>
+              <w:t>37.27</w:t>
+            </w:r>
+          </w:p>
+        </w:tc>
+        <w:tc>
+          <w:tcPr>
+            <w:tcW w:w="900" w:type="dxa"/>
+          </w:tcPr>
+          <w:p>
+            <w:pPr>
+              <w:spacing w:after="40" w:line="230" w:lineRule="auto"/>
+            </w:pPr>
+            <w:r>
+              <w:t>45.29</w:t>
             </w:r>
           </w:p>
         </w:tc>
@@ -15925,20 +15925,20 @@
               <w:spacing w:after="40" w:line="230" w:lineRule="auto"/>
             </w:pPr>
             <w:r>
-              <w:t>40.00</w:t>
-            </w:r>
-          </w:p>
-        </w:tc>
-        <w:tc>
-          <w:tcPr>
-            <w:tcW w:w="900" w:type="dxa"/>
-          </w:tcPr>
-          <w:p>
-            <w:pPr>
-              <w:spacing w:after="40" w:line="230" w:lineRule="auto"/>
-            </w:pPr>
-            <w:r>
-              <w:t>35.58</w:t>
+              <w:t>72.50</w:t>
+            </w:r>
+          </w:p>
+        </w:tc>
+        <w:tc>
+          <w:tcPr>
+            <w:tcW w:w="900" w:type="dxa"/>
+          </w:tcPr>
+          <w:p>
+            <w:pPr>
+              <w:spacing w:after="40" w:line="230" w:lineRule="auto"/>
+            </w:pPr>
+            <w:r>
+              <w:t>17.92</w:t>
             </w:r>
           </w:p>
         </w:tc>
@@ -15951,7 +15951,7 @@
               <w:spacing w:after="40" w:line="230" w:lineRule="auto"/>
             </w:pPr>
             <w:r>
-              <w:t>17/31</w:t>
+              <w:t>25/31</w:t>
             </w:r>
           </w:p>
         </w:tc>
@@ -15979,33 +15979,33 @@
               <w:spacing w:after="40" w:line="230" w:lineRule="auto"/>
             </w:pPr>
             <w:r>
-              <w:t>Database Information System</w:t>
-            </w:r>
-          </w:p>
-        </w:tc>
-        <w:tc>
-          <w:tcPr>
-            <w:tcW w:w="700" w:type="dxa"/>
-          </w:tcPr>
-          <w:p>
-            <w:pPr>
-              <w:spacing w:after="40" w:line="230" w:lineRule="auto"/>
-            </w:pPr>
-            <w:r>
-              <w:t>42.41</w:t>
-            </w:r>
-          </w:p>
-        </w:tc>
-        <w:tc>
-          <w:tcPr>
-            <w:tcW w:w="700" w:type="dxa"/>
-          </w:tcPr>
-          <w:p>
-            <w:pPr>
-              <w:spacing w:after="40" w:line="230" w:lineRule="auto"/>
-            </w:pPr>
-            <w:r>
-              <w:t>49.66</w:t>
+              <w:t>BrCRIS</w:t>
+            </w:r>
+          </w:p>
+        </w:tc>
+        <w:tc>
+          <w:tcPr>
+            <w:tcW w:w="700" w:type="dxa"/>
+          </w:tcPr>
+          <w:p>
+            <w:pPr>
+              <w:spacing w:after="40" w:line="230" w:lineRule="auto"/>
+            </w:pPr>
+            <w:r>
+              <w:t>43.03</w:t>
+            </w:r>
+          </w:p>
+        </w:tc>
+        <w:tc>
+          <w:tcPr>
+            <w:tcW w:w="700" w:type="dxa"/>
+          </w:tcPr>
+          <w:p>
+            <w:pPr>
+              <w:spacing w:after="40" w:line="230" w:lineRule="auto"/>
+            </w:pPr>
+            <w:r>
+              <w:t>44.50</w:t>
             </w:r>
           </w:p>
         </w:tc>
@@ -16031,20 +16031,20 @@
               <w:spacing w:after="40" w:line="230" w:lineRule="auto"/>
             </w:pPr>
             <w:r>
-              <w:t>70.00</w:t>
-            </w:r>
-          </w:p>
-        </w:tc>
-        <w:tc>
-          <w:tcPr>
-            <w:tcW w:w="900" w:type="dxa"/>
-          </w:tcPr>
-          <w:p>
-            <w:pPr>
-              <w:spacing w:after="40" w:line="230" w:lineRule="auto"/>
-            </w:pPr>
-            <w:r>
-              <w:t>0.00</w:t>
+              <w:t>40.00</w:t>
+            </w:r>
+          </w:p>
+        </w:tc>
+        <w:tc>
+          <w:tcPr>
+            <w:tcW w:w="900" w:type="dxa"/>
+          </w:tcPr>
+          <w:p>
+            <w:pPr>
+              <w:spacing w:after="40" w:line="230" w:lineRule="auto"/>
+            </w:pPr>
+            <w:r>
+              <w:t>37.62</w:t>
             </w:r>
           </w:p>
         </w:tc>
@@ -16057,7 +16057,7 @@
               <w:spacing w:after="40" w:line="230" w:lineRule="auto"/>
             </w:pPr>
             <w:r>
-              <w:t>22/31</w:t>
+              <w:t>20/31</w:t>
             </w:r>
           </w:p>
         </w:tc>
@@ -16085,46 +16085,46 @@
               <w:spacing w:after="40" w:line="230" w:lineRule="auto"/>
             </w:pPr>
             <w:r>
-              <w:t>OpenEdition</w:t>
-            </w:r>
-          </w:p>
-        </w:tc>
-        <w:tc>
-          <w:tcPr>
-            <w:tcW w:w="700" w:type="dxa"/>
-          </w:tcPr>
-          <w:p>
-            <w:pPr>
-              <w:spacing w:after="40" w:line="230" w:lineRule="auto"/>
-            </w:pPr>
-            <w:r>
-              <w:t>42.21</w:t>
-            </w:r>
-          </w:p>
-        </w:tc>
-        <w:tc>
-          <w:tcPr>
-            <w:tcW w:w="700" w:type="dxa"/>
-          </w:tcPr>
-          <w:p>
-            <w:pPr>
-              <w:spacing w:after="40" w:line="230" w:lineRule="auto"/>
-            </w:pPr>
-            <w:r>
-              <w:t>44.53</w:t>
-            </w:r>
-          </w:p>
-        </w:tc>
-        <w:tc>
-          <w:tcPr>
-            <w:tcW w:w="900" w:type="dxa"/>
-          </w:tcPr>
-          <w:p>
-            <w:pPr>
-              <w:spacing w:after="40" w:line="230" w:lineRule="auto"/>
-            </w:pPr>
-            <w:r>
-              <w:t>80.86</w:t>
+              <w:t>Database Information System</w:t>
+            </w:r>
+          </w:p>
+        </w:tc>
+        <w:tc>
+          <w:tcPr>
+            <w:tcW w:w="700" w:type="dxa"/>
+          </w:tcPr>
+          <w:p>
+            <w:pPr>
+              <w:spacing w:after="40" w:line="230" w:lineRule="auto"/>
+            </w:pPr>
+            <w:r>
+              <w:t>42.41</w:t>
+            </w:r>
+          </w:p>
+        </w:tc>
+        <w:tc>
+          <w:tcPr>
+            <w:tcW w:w="700" w:type="dxa"/>
+          </w:tcPr>
+          <w:p>
+            <w:pPr>
+              <w:spacing w:after="40" w:line="230" w:lineRule="auto"/>
+            </w:pPr>
+            <w:r>
+              <w:t>49.66</w:t>
+            </w:r>
+          </w:p>
+        </w:tc>
+        <w:tc>
+          <w:tcPr>
+            <w:tcW w:w="900" w:type="dxa"/>
+          </w:tcPr>
+          <w:p>
+            <w:pPr>
+              <w:spacing w:after="40" w:line="230" w:lineRule="auto"/>
+            </w:pPr>
+            <w:r>
+              <w:t>50.00</w:t>
             </w:r>
           </w:p>
         </w:tc>
@@ -16137,20 +16137,20 @@
               <w:spacing w:after="40" w:line="230" w:lineRule="auto"/>
             </w:pPr>
             <w:r>
-              <w:t>20.00</w:t>
-            </w:r>
-          </w:p>
-        </w:tc>
-        <w:tc>
-          <w:tcPr>
-            <w:tcW w:w="900" w:type="dxa"/>
-          </w:tcPr>
-          <w:p>
-            <w:pPr>
-              <w:spacing w:after="40" w:line="230" w:lineRule="auto"/>
-            </w:pPr>
-            <w:r>
-              <w:t>23.46</w:t>
+              <w:t>70.00</w:t>
+            </w:r>
+          </w:p>
+        </w:tc>
+        <w:tc>
+          <w:tcPr>
+            <w:tcW w:w="900" w:type="dxa"/>
+          </w:tcPr>
+          <w:p>
+            <w:pPr>
+              <w:spacing w:after="40" w:line="230" w:lineRule="auto"/>
+            </w:pPr>
+            <w:r>
+              <w:t>0.00</w:t>
             </w:r>
           </w:p>
         </w:tc>
@@ -16191,46 +16191,46 @@
               <w:spacing w:after="40" w:line="230" w:lineRule="auto"/>
             </w:pPr>
             <w:r>
-              <w:t>Archival Resource Key</w:t>
-            </w:r>
-          </w:p>
-        </w:tc>
-        <w:tc>
-          <w:tcPr>
-            <w:tcW w:w="700" w:type="dxa"/>
-          </w:tcPr>
-          <w:p>
-            <w:pPr>
-              <w:spacing w:after="40" w:line="230" w:lineRule="auto"/>
-            </w:pPr>
-            <w:r>
-              <w:t>41.87</w:t>
-            </w:r>
-          </w:p>
-        </w:tc>
-        <w:tc>
-          <w:tcPr>
-            <w:tcW w:w="700" w:type="dxa"/>
-          </w:tcPr>
-          <w:p>
-            <w:pPr>
-              <w:spacing w:after="40" w:line="230" w:lineRule="auto"/>
-            </w:pPr>
-            <w:r>
-              <w:t>67.59</w:t>
-            </w:r>
-          </w:p>
-        </w:tc>
-        <w:tc>
-          <w:tcPr>
-            <w:tcW w:w="900" w:type="dxa"/>
-          </w:tcPr>
-          <w:p>
-            <w:pPr>
-              <w:spacing w:after="40" w:line="230" w:lineRule="auto"/>
-            </w:pPr>
-            <w:r>
-              <w:t>45.29</w:t>
+              <w:t>OpenEdition</w:t>
+            </w:r>
+          </w:p>
+        </w:tc>
+        <w:tc>
+          <w:tcPr>
+            <w:tcW w:w="700" w:type="dxa"/>
+          </w:tcPr>
+          <w:p>
+            <w:pPr>
+              <w:spacing w:after="40" w:line="230" w:lineRule="auto"/>
+            </w:pPr>
+            <w:r>
+              <w:t>42.21</w:t>
+            </w:r>
+          </w:p>
+        </w:tc>
+        <w:tc>
+          <w:tcPr>
+            <w:tcW w:w="700" w:type="dxa"/>
+          </w:tcPr>
+          <w:p>
+            <w:pPr>
+              <w:spacing w:after="40" w:line="230" w:lineRule="auto"/>
+            </w:pPr>
+            <w:r>
+              <w:t>44.53</w:t>
+            </w:r>
+          </w:p>
+        </w:tc>
+        <w:tc>
+          <w:tcPr>
+            <w:tcW w:w="900" w:type="dxa"/>
+          </w:tcPr>
+          <w:p>
+            <w:pPr>
+              <w:spacing w:after="40" w:line="230" w:lineRule="auto"/>
+            </w:pPr>
+            <w:r>
+              <w:t>80.86</w:t>
             </w:r>
           </w:p>
         </w:tc>
@@ -16243,20 +16243,20 @@
               <w:spacing w:after="40" w:line="230" w:lineRule="auto"/>
             </w:pPr>
             <w:r>
-              <w:t>31.11</w:t>
-            </w:r>
-          </w:p>
-        </w:tc>
-        <w:tc>
-          <w:tcPr>
-            <w:tcW w:w="900" w:type="dxa"/>
-          </w:tcPr>
-          <w:p>
-            <w:pPr>
-              <w:spacing w:after="40" w:line="230" w:lineRule="auto"/>
-            </w:pPr>
-            <w:r>
-              <w:t>23.49</w:t>
+              <w:t>20.00</w:t>
+            </w:r>
+          </w:p>
+        </w:tc>
+        <w:tc>
+          <w:tcPr>
+            <w:tcW w:w="900" w:type="dxa"/>
+          </w:tcPr>
+          <w:p>
+            <w:pPr>
+              <w:spacing w:after="40" w:line="230" w:lineRule="auto"/>
+            </w:pPr>
+            <w:r>
+              <w:t>23.46</w:t>
             </w:r>
           </w:p>
         </w:tc>
@@ -16269,7 +16269,7 @@
               <w:spacing w:after="40" w:line="230" w:lineRule="auto"/>
             </w:pPr>
             <w:r>
-              <w:t>19/31</w:t>
+              <w:t>22/31</w:t>
             </w:r>
           </w:p>
         </w:tc>
@@ -16403,46 +16403,46 @@
               <w:spacing w:after="40" w:line="230" w:lineRule="auto"/>
             </w:pPr>
             <w:r>
-              <w:t>Data Citation Corpus</w:t>
-            </w:r>
-          </w:p>
-        </w:tc>
-        <w:tc>
-          <w:tcPr>
-            <w:tcW w:w="700" w:type="dxa"/>
-          </w:tcPr>
-          <w:p>
-            <w:pPr>
-              <w:spacing w:after="40" w:line="230" w:lineRule="auto"/>
-            </w:pPr>
-            <w:r>
-              <w:t>39.12</w:t>
-            </w:r>
-          </w:p>
-        </w:tc>
-        <w:tc>
-          <w:tcPr>
-            <w:tcW w:w="700" w:type="dxa"/>
-          </w:tcPr>
-          <w:p>
-            <w:pPr>
-              <w:spacing w:after="40" w:line="230" w:lineRule="auto"/>
-            </w:pPr>
-            <w:r>
-              <w:t>59.54</w:t>
-            </w:r>
-          </w:p>
-        </w:tc>
-        <w:tc>
-          <w:tcPr>
-            <w:tcW w:w="900" w:type="dxa"/>
-          </w:tcPr>
-          <w:p>
-            <w:pPr>
-              <w:spacing w:after="40" w:line="230" w:lineRule="auto"/>
-            </w:pPr>
-            <w:r>
-              <w:t>40.43</w:t>
+              <w:t>Metadata Encoding and Transmission Standard (METS)</w:t>
+            </w:r>
+          </w:p>
+        </w:tc>
+        <w:tc>
+          <w:tcPr>
+            <w:tcW w:w="700" w:type="dxa"/>
+          </w:tcPr>
+          <w:p>
+            <w:pPr>
+              <w:spacing w:after="40" w:line="230" w:lineRule="auto"/>
+            </w:pPr>
+            <w:r>
+              <w:t>39.32</w:t>
+            </w:r>
+          </w:p>
+        </w:tc>
+        <w:tc>
+          <w:tcPr>
+            <w:tcW w:w="700" w:type="dxa"/>
+          </w:tcPr>
+          <w:p>
+            <w:pPr>
+              <w:spacing w:after="40" w:line="230" w:lineRule="auto"/>
+            </w:pPr>
+            <w:r>
+              <w:t>51.64</w:t>
+            </w:r>
+          </w:p>
+        </w:tc>
+        <w:tc>
+          <w:tcPr>
+            <w:tcW w:w="900" w:type="dxa"/>
+          </w:tcPr>
+          <w:p>
+            <w:pPr>
+              <w:spacing w:after="40" w:line="230" w:lineRule="auto"/>
+            </w:pPr>
+            <w:r>
+              <w:t>50.00</w:t>
             </w:r>
           </w:p>
         </w:tc>
@@ -16455,20 +16455,20 @@
               <w:spacing w:after="40" w:line="230" w:lineRule="auto"/>
             </w:pPr>
             <w:r>
-              <w:t>48.61</w:t>
-            </w:r>
-          </w:p>
-        </w:tc>
-        <w:tc>
-          <w:tcPr>
-            <w:tcW w:w="900" w:type="dxa"/>
-          </w:tcPr>
-          <w:p>
-            <w:pPr>
-              <w:spacing w:after="40" w:line="230" w:lineRule="auto"/>
-            </w:pPr>
-            <w:r>
-              <w:t>7.90</w:t>
+              <w:t>52.50</w:t>
+            </w:r>
+          </w:p>
+        </w:tc>
+        <w:tc>
+          <w:tcPr>
+            <w:tcW w:w="900" w:type="dxa"/>
+          </w:tcPr>
+          <w:p>
+            <w:pPr>
+              <w:spacing w:after="40" w:line="230" w:lineRule="auto"/>
+            </w:pPr>
+            <w:r>
+              <w:t>3.15</w:t>
             </w:r>
           </w:p>
         </w:tc>
@@ -16509,46 +16509,46 @@
               <w:spacing w:after="40" w:line="230" w:lineRule="auto"/>
             </w:pPr>
             <w:r>
-              <w:t>AfricArXiv</w:t>
-            </w:r>
-          </w:p>
-        </w:tc>
-        <w:tc>
-          <w:tcPr>
-            <w:tcW w:w="700" w:type="dxa"/>
-          </w:tcPr>
-          <w:p>
-            <w:pPr>
-              <w:spacing w:after="40" w:line="230" w:lineRule="auto"/>
-            </w:pPr>
-            <w:r>
-              <w:t>39.08</w:t>
-            </w:r>
-          </w:p>
-        </w:tc>
-        <w:tc>
-          <w:tcPr>
-            <w:tcW w:w="700" w:type="dxa"/>
-          </w:tcPr>
-          <w:p>
-            <w:pPr>
-              <w:spacing w:after="40" w:line="230" w:lineRule="auto"/>
-            </w:pPr>
-            <w:r>
-              <w:t>22.17</w:t>
-            </w:r>
-          </w:p>
-        </w:tc>
-        <w:tc>
-          <w:tcPr>
-            <w:tcW w:w="900" w:type="dxa"/>
-          </w:tcPr>
-          <w:p>
-            <w:pPr>
-              <w:spacing w:after="40" w:line="230" w:lineRule="auto"/>
-            </w:pPr>
-            <w:r>
-              <w:t>69.14</w:t>
+              <w:t>Data Citation Corpus</w:t>
+            </w:r>
+          </w:p>
+        </w:tc>
+        <w:tc>
+          <w:tcPr>
+            <w:tcW w:w="700" w:type="dxa"/>
+          </w:tcPr>
+          <w:p>
+            <w:pPr>
+              <w:spacing w:after="40" w:line="230" w:lineRule="auto"/>
+            </w:pPr>
+            <w:r>
+              <w:t>39.12</w:t>
+            </w:r>
+          </w:p>
+        </w:tc>
+        <w:tc>
+          <w:tcPr>
+            <w:tcW w:w="700" w:type="dxa"/>
+          </w:tcPr>
+          <w:p>
+            <w:pPr>
+              <w:spacing w:after="40" w:line="230" w:lineRule="auto"/>
+            </w:pPr>
+            <w:r>
+              <w:t>59.54</w:t>
+            </w:r>
+          </w:p>
+        </w:tc>
+        <w:tc>
+          <w:tcPr>
+            <w:tcW w:w="900" w:type="dxa"/>
+          </w:tcPr>
+          <w:p>
+            <w:pPr>
+              <w:spacing w:after="40" w:line="230" w:lineRule="auto"/>
+            </w:pPr>
+            <w:r>
+              <w:t>40.43</w:t>
             </w:r>
           </w:p>
         </w:tc>
@@ -16561,20 +16561,20 @@
               <w:spacing w:after="40" w:line="230" w:lineRule="auto"/>
             </w:pPr>
             <w:r>
-              <w:t>65.00</w:t>
-            </w:r>
-          </w:p>
-        </w:tc>
-        <w:tc>
-          <w:tcPr>
-            <w:tcW w:w="900" w:type="dxa"/>
-          </w:tcPr>
-          <w:p>
-            <w:pPr>
-              <w:spacing w:after="40" w:line="230" w:lineRule="auto"/>
-            </w:pPr>
-            <w:r>
-              <w:t>0.00</w:t>
+              <w:t>48.61</w:t>
+            </w:r>
+          </w:p>
+        </w:tc>
+        <w:tc>
+          <w:tcPr>
+            <w:tcW w:w="900" w:type="dxa"/>
+          </w:tcPr>
+          <w:p>
+            <w:pPr>
+              <w:spacing w:after="40" w:line="230" w:lineRule="auto"/>
+            </w:pPr>
+            <w:r>
+              <w:t>7.90</w:t>
             </w:r>
           </w:p>
         </w:tc>
@@ -16587,7 +16587,7 @@
               <w:spacing w:after="40" w:line="230" w:lineRule="auto"/>
             </w:pPr>
             <w:r>
-              <w:t>13/31</w:t>
+              <w:t>26/31</w:t>
             </w:r>
           </w:p>
         </w:tc>
@@ -16615,46 +16615,46 @@
               <w:spacing w:after="40" w:line="230" w:lineRule="auto"/>
             </w:pPr>
             <w:r>
-              <w:t>medRxiv</w:t>
-            </w:r>
-          </w:p>
-        </w:tc>
-        <w:tc>
-          <w:tcPr>
-            <w:tcW w:w="700" w:type="dxa"/>
-          </w:tcPr>
-          <w:p>
-            <w:pPr>
-              <w:spacing w:after="40" w:line="230" w:lineRule="auto"/>
-            </w:pPr>
-            <w:r>
-              <w:t>38.78</w:t>
-            </w:r>
-          </w:p>
-        </w:tc>
-        <w:tc>
-          <w:tcPr>
-            <w:tcW w:w="700" w:type="dxa"/>
-          </w:tcPr>
-          <w:p>
-            <w:pPr>
-              <w:spacing w:after="40" w:line="230" w:lineRule="auto"/>
-            </w:pPr>
-            <w:r>
-              <w:t>35.56</w:t>
-            </w:r>
-          </w:p>
-        </w:tc>
-        <w:tc>
-          <w:tcPr>
-            <w:tcW w:w="900" w:type="dxa"/>
-          </w:tcPr>
-          <w:p>
-            <w:pPr>
-              <w:spacing w:after="40" w:line="230" w:lineRule="auto"/>
-            </w:pPr>
-            <w:r>
-              <w:t>59.57</w:t>
+              <w:t>AfricArXiv</w:t>
+            </w:r>
+          </w:p>
+        </w:tc>
+        <w:tc>
+          <w:tcPr>
+            <w:tcW w:w="700" w:type="dxa"/>
+          </w:tcPr>
+          <w:p>
+            <w:pPr>
+              <w:spacing w:after="40" w:line="230" w:lineRule="auto"/>
+            </w:pPr>
+            <w:r>
+              <w:t>39.08</w:t>
+            </w:r>
+          </w:p>
+        </w:tc>
+        <w:tc>
+          <w:tcPr>
+            <w:tcW w:w="700" w:type="dxa"/>
+          </w:tcPr>
+          <w:p>
+            <w:pPr>
+              <w:spacing w:after="40" w:line="230" w:lineRule="auto"/>
+            </w:pPr>
+            <w:r>
+              <w:t>22.17</w:t>
+            </w:r>
+          </w:p>
+        </w:tc>
+        <w:tc>
+          <w:tcPr>
+            <w:tcW w:w="900" w:type="dxa"/>
+          </w:tcPr>
+          <w:p>
+            <w:pPr>
+              <w:spacing w:after="40" w:line="230" w:lineRule="auto"/>
+            </w:pPr>
+            <w:r>
+              <w:t>69.14</w:t>
             </w:r>
           </w:p>
         </w:tc>
@@ -16667,7 +16667,7 @@
               <w:spacing w:after="40" w:line="230" w:lineRule="auto"/>
             </w:pPr>
             <w:r>
-              <w:t>60.00</w:t>
+              <w:t>65.00</w:t>
             </w:r>
           </w:p>
         </w:tc>
@@ -16721,46 +16721,46 @@
               <w:spacing w:after="40" w:line="230" w:lineRule="auto"/>
             </w:pPr>
             <w:r>
-              <w:t>Pundit</w:t>
-            </w:r>
-          </w:p>
-        </w:tc>
-        <w:tc>
-          <w:tcPr>
-            <w:tcW w:w="700" w:type="dxa"/>
-          </w:tcPr>
-          <w:p>
-            <w:pPr>
-              <w:spacing w:after="40" w:line="230" w:lineRule="auto"/>
-            </w:pPr>
-            <w:r>
-              <w:t>38.66</w:t>
-            </w:r>
-          </w:p>
-        </w:tc>
-        <w:tc>
-          <w:tcPr>
-            <w:tcW w:w="700" w:type="dxa"/>
-          </w:tcPr>
-          <w:p>
-            <w:pPr>
-              <w:spacing w:after="40" w:line="230" w:lineRule="auto"/>
-            </w:pPr>
-            <w:r>
-              <w:t>38.98</w:t>
-            </w:r>
-          </w:p>
-        </w:tc>
-        <w:tc>
-          <w:tcPr>
-            <w:tcW w:w="900" w:type="dxa"/>
-          </w:tcPr>
-          <w:p>
-            <w:pPr>
-              <w:spacing w:after="40" w:line="230" w:lineRule="auto"/>
-            </w:pPr>
-            <w:r>
-              <w:t>23.71</w:t>
+              <w:t>medRxiv</w:t>
+            </w:r>
+          </w:p>
+        </w:tc>
+        <w:tc>
+          <w:tcPr>
+            <w:tcW w:w="700" w:type="dxa"/>
+          </w:tcPr>
+          <w:p>
+            <w:pPr>
+              <w:spacing w:after="40" w:line="230" w:lineRule="auto"/>
+            </w:pPr>
+            <w:r>
+              <w:t>38.78</w:t>
+            </w:r>
+          </w:p>
+        </w:tc>
+        <w:tc>
+          <w:tcPr>
+            <w:tcW w:w="700" w:type="dxa"/>
+          </w:tcPr>
+          <w:p>
+            <w:pPr>
+              <w:spacing w:after="40" w:line="230" w:lineRule="auto"/>
+            </w:pPr>
+            <w:r>
+              <w:t>35.56</w:t>
+            </w:r>
+          </w:p>
+        </w:tc>
+        <w:tc>
+          <w:tcPr>
+            <w:tcW w:w="900" w:type="dxa"/>
+          </w:tcPr>
+          <w:p>
+            <w:pPr>
+              <w:spacing w:after="40" w:line="230" w:lineRule="auto"/>
+            </w:pPr>
+            <w:r>
+              <w:t>59.57</w:t>
             </w:r>
           </w:p>
         </w:tc>
@@ -16773,20 +16773,20 @@
               <w:spacing w:after="40" w:line="230" w:lineRule="auto"/>
             </w:pPr>
             <w:r>
-              <w:t>70.00</w:t>
-            </w:r>
-          </w:p>
-        </w:tc>
-        <w:tc>
-          <w:tcPr>
-            <w:tcW w:w="900" w:type="dxa"/>
-          </w:tcPr>
-          <w:p>
-            <w:pPr>
-              <w:spacing w:after="40" w:line="230" w:lineRule="auto"/>
-            </w:pPr>
-            <w:r>
-              <w:t>21.95</w:t>
+              <w:t>60.00</w:t>
+            </w:r>
+          </w:p>
+        </w:tc>
+        <w:tc>
+          <w:tcPr>
+            <w:tcW w:w="900" w:type="dxa"/>
+          </w:tcPr>
+          <w:p>
+            <w:pPr>
+              <w:spacing w:after="40" w:line="230" w:lineRule="auto"/>
+            </w:pPr>
+            <w:r>
+              <w:t>0.00</w:t>
             </w:r>
           </w:p>
         </w:tc>
@@ -16799,7 +16799,7 @@
               <w:spacing w:after="40" w:line="230" w:lineRule="auto"/>
             </w:pPr>
             <w:r>
-              <w:t>26/31</w:t>
+              <w:t>13/31</w:t>
             </w:r>
           </w:p>
         </w:tc>
@@ -16827,46 +16827,46 @@
               <w:spacing w:after="40" w:line="230" w:lineRule="auto"/>
             </w:pPr>
             <w:r>
-              <w:t>Metadata Encoding and Transmission Standard (METS)</w:t>
-            </w:r>
-          </w:p>
-        </w:tc>
-        <w:tc>
-          <w:tcPr>
-            <w:tcW w:w="700" w:type="dxa"/>
-          </w:tcPr>
-          <w:p>
-            <w:pPr>
-              <w:spacing w:after="40" w:line="230" w:lineRule="auto"/>
-            </w:pPr>
-            <w:r>
-              <w:t>38.53</w:t>
-            </w:r>
-          </w:p>
-        </w:tc>
-        <w:tc>
-          <w:tcPr>
-            <w:tcW w:w="700" w:type="dxa"/>
-          </w:tcPr>
-          <w:p>
-            <w:pPr>
-              <w:spacing w:after="40" w:line="230" w:lineRule="auto"/>
-            </w:pPr>
-            <w:r>
-              <w:t>51.64</w:t>
-            </w:r>
-          </w:p>
-        </w:tc>
-        <w:tc>
-          <w:tcPr>
-            <w:tcW w:w="900" w:type="dxa"/>
-          </w:tcPr>
-          <w:p>
-            <w:pPr>
-              <w:spacing w:after="40" w:line="230" w:lineRule="auto"/>
-            </w:pPr>
-            <w:r>
-              <w:t>50.00</w:t>
+              <w:t>Pundit</w:t>
+            </w:r>
+          </w:p>
+        </w:tc>
+        <w:tc>
+          <w:tcPr>
+            <w:tcW w:w="700" w:type="dxa"/>
+          </w:tcPr>
+          <w:p>
+            <w:pPr>
+              <w:spacing w:after="40" w:line="230" w:lineRule="auto"/>
+            </w:pPr>
+            <w:r>
+              <w:t>38.66</w:t>
+            </w:r>
+          </w:p>
+        </w:tc>
+        <w:tc>
+          <w:tcPr>
+            <w:tcW w:w="700" w:type="dxa"/>
+          </w:tcPr>
+          <w:p>
+            <w:pPr>
+              <w:spacing w:after="40" w:line="230" w:lineRule="auto"/>
+            </w:pPr>
+            <w:r>
+              <w:t>38.98</w:t>
+            </w:r>
+          </w:p>
+        </w:tc>
+        <w:tc>
+          <w:tcPr>
+            <w:tcW w:w="900" w:type="dxa"/>
+          </w:tcPr>
+          <w:p>
+            <w:pPr>
+              <w:spacing w:after="40" w:line="230" w:lineRule="auto"/>
+            </w:pPr>
+            <w:r>
+              <w:t>23.71</w:t>
             </w:r>
           </w:p>
         </w:tc>
@@ -16879,20 +16879,20 @@
               <w:spacing w:after="40" w:line="230" w:lineRule="auto"/>
             </w:pPr>
             <w:r>
-              <w:t>52.50</w:t>
-            </w:r>
-          </w:p>
-        </w:tc>
-        <w:tc>
-          <w:tcPr>
-            <w:tcW w:w="900" w:type="dxa"/>
-          </w:tcPr>
-          <w:p>
-            <w:pPr>
-              <w:spacing w:after="40" w:line="230" w:lineRule="auto"/>
-            </w:pPr>
-            <w:r>
-              <w:t>0.00</w:t>
+              <w:t>70.00</w:t>
+            </w:r>
+          </w:p>
+        </w:tc>
+        <w:tc>
+          <w:tcPr>
+            <w:tcW w:w="900" w:type="dxa"/>
+          </w:tcPr>
+          <w:p>
+            <w:pPr>
+              <w:spacing w:after="40" w:line="230" w:lineRule="auto"/>
+            </w:pPr>
+            <w:r>
+              <w:t>21.95</w:t>
             </w:r>
           </w:p>
         </w:tc>
@@ -16905,7 +16905,7 @@
               <w:spacing w:after="40" w:line="230" w:lineRule="auto"/>
             </w:pPr>
             <w:r>
-              <w:t>24/31</w:t>
+              <w:t>26/31</w:t>
             </w:r>
           </w:p>
         </w:tc>

</xml_diff>